<commit_message>
ISFARIS-16 ISFARIS-17 ISFARIS-23 aggiunta sezione 3.3.1, 3.3.2, 3.3.8
</commit_message>
<xml_diff>
--- a/docs/deliverables/RAD/NC13_RAD_ver.0.3.docx
+++ b/docs/deliverables/RAD/NC13_RAD_ver.0.3.docx
@@ -36,7 +36,7 @@
                 <w:noProof/>
               </w:rPr>
               <w:drawing>
-                <wp:anchor distT="0" distB="0" distL="114300" distR="114300" simplePos="0" relativeHeight="251658240" behindDoc="0" locked="0" layoutInCell="1" allowOverlap="1" wp14:anchorId="5805D85E" wp14:editId="1847AE7E">
+                <wp:anchor distT="0" distB="0" distL="114300" distR="114300" simplePos="0" relativeHeight="251658240" behindDoc="0" locked="0" layoutInCell="1" allowOverlap="1" wp14:anchorId="5805D85E" wp14:editId="358F8235">
                   <wp:simplePos x="0" y="0"/>
                   <wp:positionH relativeFrom="margin">
                     <wp:align>center</wp:align>
@@ -44,7 +44,7 @@
                   <wp:positionV relativeFrom="margin">
                     <wp:align>top</wp:align>
                   </wp:positionV>
-                  <wp:extent cx="4946650" cy="3695700"/>
+                  <wp:extent cx="4721666" cy="3527612"/>
                   <wp:effectExtent l="0" t="0" r="0" b="0"/>
                   <wp:wrapSquare wrapText="bothSides"/>
                   <wp:docPr id="2129765905" name="Immagine 2"/>
@@ -66,6 +66,7 @@
                               </a:ext>
                             </a:extLst>
                           </a:blip>
+                          <a:srcRect/>
                           <a:stretch>
                             <a:fillRect/>
                           </a:stretch>
@@ -73,7 +74,7 @@
                         <pic:spPr>
                           <a:xfrm>
                             <a:off x="0" y="0"/>
-                            <a:ext cx="4946650" cy="3695700"/>
+                            <a:ext cx="4721666" cy="3527612"/>
                           </a:xfrm>
                           <a:prstGeom prst="rect">
                             <a:avLst/>
@@ -4710,9 +4711,8 @@
         <w:spacing w:before="0" w:after="0" w:line="276" w:lineRule="auto"/>
         <w:ind w:left="708" w:hanging="708"/>
         <w:rPr>
-          <w:rFonts w:ascii="Calibri" w:eastAsia="Aptos Display" w:hAnsi="Calibri" w:cs="Calibri"/>
-          <w:b/>
-          <w:bCs/>
+          <w:rFonts w:ascii="Calibri" w:eastAsiaTheme="minorHAnsi" w:hAnsi="Calibri" w:cs="Calibri"/>
+          <w:sz w:val="24"/>
         </w:rPr>
       </w:pPr>
       <w:bookmarkStart w:id="8" w:name="_Toc810292790"/>
@@ -4743,15 +4743,51 @@
     </w:p>
     <w:p>
       <w:pPr>
-        <w:spacing w:line="276" w:lineRule="auto"/>
-      </w:pPr>
-      <w:r>
-        <w:rPr>
-          <w:rFonts w:eastAsia="Calibri"/>
-        </w:rPr>
-        <w:t xml:space="preserve"> </w:t>
+        <w:pStyle w:val="Paragrafoelenco"/>
+        <w:numPr>
+          <w:ilvl w:val="0"/>
+          <w:numId w:val="22"/>
+        </w:numPr>
+        <w:rPr>
+          <w:rStyle w:val="Collegamentoipertestuale"/>
+        </w:rPr>
+      </w:pPr>
+      <w:r>
+        <w:fldChar w:fldCharType="begin"/>
+      </w:r>
+      <w:r>
+        <w:instrText>HYPERLINK "https://github.com/AndreaRainone/FARIS/blob/main/docs/deliverables/StatementOfWork.pdf" \o "https://github.com/AndreaRainone/FARIS/blob/main/docs/deliverables/StatementOfWork.pdf"</w:instrText>
+      </w:r>
+      <w:r>
+        <w:fldChar w:fldCharType="separate"/>
+      </w:r>
+      <w:r>
+        <w:rPr>
+          <w:rStyle w:val="Collegamentoipertestuale"/>
+        </w:rPr>
+        <w:t>Statemen</w:t>
+      </w:r>
+      <w:r>
+        <w:rPr>
+          <w:rStyle w:val="Collegamentoipertestuale"/>
+        </w:rPr>
+        <w:t>t</w:t>
+      </w:r>
+      <w:r>
+        <w:rPr>
+          <w:rStyle w:val="Collegamentoipertestuale"/>
+        </w:rPr>
+        <w:t xml:space="preserve"> of </w:t>
+      </w:r>
+      <w:r>
+        <w:rPr>
+          <w:rStyle w:val="Collegamentoipertestuale"/>
+        </w:rPr>
+        <w:t>work</w:t>
       </w:r>
     </w:p>
+    <w:bookmarkStart w:id="10" w:name="_Toc1341300485"/>
+    <w:bookmarkStart w:id="11" w:name="_Toc243217720"/>
     <w:p>
       <w:pPr>
         <w:pStyle w:val="Titolo2"/>
@@ -4763,8 +4799,13 @@
           <w:bCs/>
         </w:rPr>
       </w:pPr>
-      <w:bookmarkStart w:id="10" w:name="_Toc1341300485"/>
-      <w:bookmarkStart w:id="11" w:name="_Toc243217720"/>
+      <w:r>
+        <w:rPr>
+          <w:rFonts w:ascii="Calibri" w:eastAsiaTheme="minorHAnsi" w:hAnsi="Calibri" w:cs="Calibri"/>
+          <w:sz w:val="24"/>
+        </w:rPr>
+        <w:fldChar w:fldCharType="end"/>
+      </w:r>
       <w:r>
         <w:rPr>
           <w:rFonts w:ascii="Calibri" w:eastAsia="Aptos Display" w:hAnsi="Calibri" w:cs="Calibri"/>
@@ -4954,22 +4995,359 @@
     </w:p>
     <w:p>
       <w:r>
-        <w:t>TESTO TESTO TESTO TESTO TESTO TESTO TESTO TESTO TESTO TESTO TESTO TESTO TESTO TESTO TESTO TESTO</w:t>
+        <w:t>Attualmente,</w:t>
+      </w:r>
+      <w:r>
+        <w:t xml:space="preserve"> lettori assidui di notizie, professionisti e studenti universitari</w:t>
+      </w:r>
+      <w:r>
+        <w:t xml:space="preserve"> non hanno a disposizione un mezzo che gli permetta </w:t>
+      </w:r>
+      <w:r>
+        <w:t xml:space="preserve">facilmente </w:t>
+      </w:r>
+      <w:r>
+        <w:t>di confrontare notizie provenienti da va</w:t>
+      </w:r>
+      <w:r>
+        <w:t xml:space="preserve">rie </w:t>
+      </w:r>
+      <w:r>
+        <w:t>fonti</w:t>
+      </w:r>
+      <w:r>
+        <w:t xml:space="preserve">. Questo costringe gli utenti a confrontare manualmente </w:t>
+      </w:r>
+      <w:r>
+        <w:t xml:space="preserve">notizie da varie fonti, impattando </w:t>
+      </w:r>
+      <w:r>
+        <w:t>sul tempo di lettura, volontà di leggere nuove notizie e c</w:t>
+      </w:r>
+      <w:r>
+        <w:t>omprensione della notizia stessa.</w:t>
+      </w:r>
+      <w:r>
+        <w:tab/>
+      </w:r>
+      <w:r>
+        <w:t xml:space="preserve"> Il sistema attuale, inoltre, non permette all’utente di filtrare tra fronti di notizie attendibili e no</w:t>
+      </w:r>
+      <w:r>
+        <w:t>n</w:t>
+      </w:r>
+      <w:r>
+        <w:t>,</w:t>
+      </w:r>
+      <w:r>
+        <w:t xml:space="preserve"> richiedendo</w:t>
+      </w:r>
+      <w:r>
+        <w:t xml:space="preserve"> che l’utente sappia </w:t>
+      </w:r>
+      <w:r>
+        <w:t>la differenza di tali.</w:t>
       </w:r>
     </w:p>
     <w:p>
+      <w:r>
+        <w:t>Per concludere, di seguito sono mostrati alcuni AD che illustrano i processi di business del sistema attuale:</w:t>
+      </w:r>
+    </w:p>
+    <w:p>
+      <w:r>
+        <w:rPr>
+          <w:b/>
+          <w:bCs/>
+          <w:color w:val="000000" w:themeColor="text1"/>
+        </w:rPr>
+        <w:t xml:space="preserve">AD_1: Ricerca </w:t>
+      </w:r>
+      <w:r>
+        <w:rPr>
+          <w:b/>
+          <w:bCs/>
+          <w:color w:val="000000" w:themeColor="text1"/>
+        </w:rPr>
+        <w:t>notizie</w:t>
+      </w:r>
+    </w:p>
+    <w:p>
+      <w:r>
+        <w:rPr>
+          <w:noProof/>
+        </w:rPr>
+        <w:drawing>
+          <wp:inline distT="0" distB="0" distL="0" distR="0" wp14:anchorId="11A6379E" wp14:editId="072102BF">
+            <wp:extent cx="6542617" cy="5453052"/>
+            <wp:effectExtent l="0" t="0" r="0" b="0"/>
+            <wp:docPr id="626734385" name="drawing"/>
+            <wp:cNvGraphicFramePr>
+              <a:graphicFrameLocks xmlns:a="http://schemas.openxmlformats.org/drawingml/2006/main" noChangeAspect="1"/>
+            </wp:cNvGraphicFramePr>
+            <a:graphic xmlns:a="http://schemas.openxmlformats.org/drawingml/2006/main">
+              <a:graphicData uri="http://schemas.openxmlformats.org/drawingml/2006/picture">
+                <pic:pic xmlns:pic="http://schemas.openxmlformats.org/drawingml/2006/picture">
+                  <pic:nvPicPr>
+                    <pic:cNvPr id="626734385" name="Picture 626734385"/>
+                    <pic:cNvPicPr/>
+                  </pic:nvPicPr>
+                  <pic:blipFill>
+                    <a:blip r:embed="rId12">
+                      <a:extLst>
+                        <a:ext uri="{28A0092B-C50C-407E-A947-70E740481C1C}">
+                          <a14:useLocalDpi xmlns:a14="http://schemas.microsoft.com/office/drawing/2010/main"/>
+                        </a:ext>
+                      </a:extLst>
+                    </a:blip>
+                    <a:stretch>
+                      <a:fillRect/>
+                    </a:stretch>
+                  </pic:blipFill>
+                  <pic:spPr>
+                    <a:xfrm>
+                      <a:off x="0" y="0"/>
+                      <a:ext cx="6542617" cy="5453052"/>
+                    </a:xfrm>
+                    <a:prstGeom prst="rect">
+                      <a:avLst/>
+                    </a:prstGeom>
+                  </pic:spPr>
+                </pic:pic>
+              </a:graphicData>
+            </a:graphic>
+          </wp:inline>
+        </w:drawing>
+      </w:r>
+    </w:p>
+    <w:p/>
+    <w:p>
+      <w:pPr>
+        <w:rPr>
+          <w:b/>
+          <w:color w:val="000000" w:themeColor="text1"/>
+        </w:rPr>
+      </w:pPr>
+      <w:r>
+        <w:rPr>
+          <w:b/>
+          <w:bCs/>
+          <w:color w:val="000000" w:themeColor="text1"/>
+        </w:rPr>
+        <w:lastRenderedPageBreak/>
+        <w:t>AD_1 Alternativo:</w:t>
+      </w:r>
+      <w:r>
+        <w:rPr>
+          <w:b/>
+          <w:bCs/>
+          <w:color w:val="000000" w:themeColor="text1"/>
+        </w:rPr>
+        <w:t xml:space="preserve"> Ricerca notizie</w:t>
+      </w:r>
+      <w:r>
+        <w:rPr>
+          <w:noProof/>
+        </w:rPr>
+        <w:drawing>
+          <wp:inline distT="0" distB="0" distL="0" distR="0" wp14:anchorId="59925E87" wp14:editId="0DF6960C">
+            <wp:extent cx="5772150" cy="6638925"/>
+            <wp:effectExtent l="0" t="0" r="0" b="0"/>
+            <wp:docPr id="2091929549" name="drawing"/>
+            <wp:cNvGraphicFramePr>
+              <a:graphicFrameLocks xmlns:a="http://schemas.openxmlformats.org/drawingml/2006/main" noChangeAspect="1"/>
+            </wp:cNvGraphicFramePr>
+            <a:graphic xmlns:a="http://schemas.openxmlformats.org/drawingml/2006/main">
+              <a:graphicData uri="http://schemas.openxmlformats.org/drawingml/2006/picture">
+                <pic:pic xmlns:pic="http://schemas.openxmlformats.org/drawingml/2006/picture">
+                  <pic:nvPicPr>
+                    <pic:cNvPr id="2091929549" name="Picture 2091929549"/>
+                    <pic:cNvPicPr/>
+                  </pic:nvPicPr>
+                  <pic:blipFill>
+                    <a:blip r:embed="rId13">
+                      <a:extLst>
+                        <a:ext uri="{28A0092B-C50C-407E-A947-70E740481C1C}">
+                          <a14:useLocalDpi xmlns:a14="http://schemas.microsoft.com/office/drawing/2010/main"/>
+                        </a:ext>
+                      </a:extLst>
+                    </a:blip>
+                    <a:stretch>
+                      <a:fillRect/>
+                    </a:stretch>
+                  </pic:blipFill>
+                  <pic:spPr>
+                    <a:xfrm>
+                      <a:off x="0" y="0"/>
+                      <a:ext cx="5772150" cy="6638925"/>
+                    </a:xfrm>
+                    <a:prstGeom prst="rect">
+                      <a:avLst/>
+                    </a:prstGeom>
+                  </pic:spPr>
+                </pic:pic>
+              </a:graphicData>
+            </a:graphic>
+          </wp:inline>
+        </w:drawing>
+      </w:r>
+    </w:p>
+    <w:tbl>
+      <w:tblPr>
+        <w:tblStyle w:val="Grigliatabella"/>
+        <w:tblW w:w="0" w:type="auto"/>
+        <w:tblLook w:val="06A0" w:firstRow="1" w:lastRow="0" w:firstColumn="1" w:lastColumn="0" w:noHBand="1" w:noVBand="1"/>
+      </w:tblPr>
+      <w:tblGrid>
+        <w:gridCol w:w="5228"/>
+        <w:gridCol w:w="5228"/>
+      </w:tblGrid>
+      <w:tr>
+        <w:trPr>
+          <w:trHeight w:val="300"/>
+        </w:trPr>
+        <w:tc>
+          <w:tcPr>
+            <w:tcW w:w="5228" w:type="dxa"/>
+            <w:shd w:val="clear" w:color="auto" w:fill="0070C0"/>
+          </w:tcPr>
+          <w:p>
+            <w:pPr>
+              <w:jc w:val="center"/>
+              <w:rPr>
+                <w:color w:val="auto"/>
+              </w:rPr>
+            </w:pPr>
+            <w:r>
+              <w:rPr>
+                <w:color w:val="auto"/>
+              </w:rPr>
+              <w:t>Vantaggi</w:t>
+            </w:r>
+          </w:p>
+        </w:tc>
+        <w:tc>
+          <w:tcPr>
+            <w:tcW w:w="5228" w:type="dxa"/>
+            <w:shd w:val="clear" w:color="auto" w:fill="0070C0"/>
+          </w:tcPr>
+          <w:p>
+            <w:pPr>
+              <w:jc w:val="center"/>
+              <w:rPr>
+                <w:color w:val="auto"/>
+              </w:rPr>
+            </w:pPr>
+            <w:r>
+              <w:rPr>
+                <w:color w:val="auto"/>
+              </w:rPr>
+              <w:t>Svantaggi</w:t>
+            </w:r>
+          </w:p>
+        </w:tc>
+      </w:tr>
+      <w:tr>
+        <w:trPr>
+          <w:trHeight w:val="882"/>
+        </w:trPr>
+        <w:tc>
+          <w:tcPr>
+            <w:tcW w:w="5228" w:type="dxa"/>
+            <w:shd w:val="clear" w:color="auto" w:fill="A5C9EB" w:themeFill="text2" w:themeFillTint="40"/>
+          </w:tcPr>
+          <w:p>
+            <w:pPr>
+              <w:jc w:val="center"/>
+              <w:rPr>
+                <w:color w:val="000000" w:themeColor="text1"/>
+              </w:rPr>
+            </w:pPr>
+            <w:r>
+              <w:rPr>
+                <w:color w:val="000000" w:themeColor="text1"/>
+              </w:rPr>
+              <w:t>Permette di leggere notizie da più fonti approvate.</w:t>
+            </w:r>
+          </w:p>
+          <w:p>
+            <w:pPr>
+              <w:jc w:val="center"/>
+            </w:pPr>
+            <w:r>
+              <w:rPr>
+                <w:color w:val="000000" w:themeColor="text1"/>
+              </w:rPr>
+              <w:t>Consiglia automaticamente notizie pertinenti all’utente</w:t>
+            </w:r>
+            <w:r>
+              <w:rPr>
+                <w:color w:val="000000" w:themeColor="text1"/>
+              </w:rPr>
+              <w:t>.</w:t>
+            </w:r>
+          </w:p>
+          <w:p>
+            <w:pPr>
+              <w:jc w:val="center"/>
+            </w:pPr>
+            <w:r>
+              <w:rPr>
+                <w:color w:val="000000" w:themeColor="text1"/>
+              </w:rPr>
+              <w:t xml:space="preserve">Consente all’utente di non dover confrontare manualmente le notizie da </w:t>
+            </w:r>
+            <w:r>
+              <w:rPr>
+                <w:color w:val="000000" w:themeColor="text1"/>
+              </w:rPr>
+              <w:t>più fonti.</w:t>
+            </w:r>
+          </w:p>
+        </w:tc>
+        <w:tc>
+          <w:tcPr>
+            <w:tcW w:w="5228" w:type="dxa"/>
+            <w:shd w:val="clear" w:color="auto" w:fill="A5C9EB" w:themeFill="text2" w:themeFillTint="40"/>
+          </w:tcPr>
+          <w:p>
+            <w:pPr>
+              <w:jc w:val="center"/>
+              <w:rPr>
+                <w:color w:val="000000" w:themeColor="text1"/>
+              </w:rPr>
+            </w:pPr>
+            <w:r>
+              <w:rPr>
+                <w:color w:val="000000" w:themeColor="text1"/>
+              </w:rPr>
+              <w:t>Per nuove notizie è necessario che il database sia aggiornato</w:t>
+            </w:r>
+            <w:r>
+              <w:rPr>
+                <w:color w:val="000000" w:themeColor="text1"/>
+              </w:rPr>
+              <w:t>.</w:t>
+            </w:r>
+          </w:p>
+        </w:tc>
+      </w:tr>
+    </w:tbl>
+    <w:p>
+      <w:pPr>
+        <w:spacing w:after="0" w:line="240" w:lineRule="auto"/>
+      </w:pPr>
+    </w:p>
+    <w:p>
       <w:pPr>
         <w:pStyle w:val="Titolo1"/>
-        <w:numPr>
-          <w:ilvl w:val="0"/>
-          <w:numId w:val="9"/>
-        </w:numPr>
         <w:pBdr>
           <w:bottom w:val="single" w:sz="6" w:space="1" w:color="auto"/>
         </w:pBdr>
       </w:pPr>
       <w:bookmarkStart w:id="13" w:name="_Toc243217722"/>
       <w:r>
+        <w:lastRenderedPageBreak/>
         <w:t>Sistema Proposto</w:t>
       </w:r>
       <w:bookmarkEnd w:id="13"/>
@@ -4994,58 +5372,291 @@
         <w:jc w:val="both"/>
       </w:pPr>
       <w:r>
-        <w:t>Asddsaadsdasadsasdasdadsdasadsadsadsadsadssaddasssssssssssssssssssssssssssssssssssssssssssssdsadsa</w:t>
-      </w:r>
-      <w:r>
-        <w:t xml:space="preserve"> </w:t>
-      </w:r>
-      <w:r>
-        <w:t>Asddsaadsdasadsasdasdadsdasadsadsadsadsadssaddasssssssssssssssssssssssssssssssssssssssssssssdsadsa</w:t>
+        <w:rPr>
+          <w:color w:val="000000" w:themeColor="text1"/>
+        </w:rPr>
+        <w:t xml:space="preserve">La sezione che segue è organizzata come segue: </w:t>
       </w:r>
     </w:p>
     <w:p>
       <w:pPr>
-        <w:ind w:left="360"/>
+        <w:pStyle w:val="Paragrafoelenco"/>
+        <w:numPr>
+          <w:ilvl w:val="0"/>
+          <w:numId w:val="17"/>
+        </w:numPr>
         <w:jc w:val="both"/>
-      </w:pPr>
-      <w:r>
-        <w:t>Asddsaadsdasadsasdasdadsdasadsadsadsadsadssaddasssssssssssssssssssssssssssssssssssssssssssssdsadsa</w:t>
+        <w:rPr>
+          <w:color w:val="000000" w:themeColor="text1"/>
+        </w:rPr>
+      </w:pPr>
+      <w:r>
+        <w:rPr>
+          <w:b/>
+          <w:bCs/>
+          <w:color w:val="000000" w:themeColor="text1"/>
+        </w:rPr>
+        <w:t>Requisiti</w:t>
+      </w:r>
+      <w:r>
+        <w:rPr>
+          <w:b/>
+          <w:color w:val="000000" w:themeColor="text1"/>
+        </w:rPr>
+        <w:t xml:space="preserve"> funzionali</w:t>
+      </w:r>
+      <w:r>
+        <w:rPr>
+          <w:b/>
+          <w:color w:val="000000" w:themeColor="text1"/>
+        </w:rPr>
+        <w:t>:</w:t>
+      </w:r>
+      <w:r>
+        <w:rPr>
+          <w:color w:val="000000" w:themeColor="text1"/>
+        </w:rPr>
+        <w:t xml:space="preserve"> descrizione degli attori e dei requisiti funzionali, ovvero descrizione delle interazioni tra il sistema e l’ambiente esterno, quindi gli attori senza tenere in considerazione l’implementazione. </w:t>
       </w:r>
     </w:p>
     <w:p>
       <w:pPr>
-        <w:ind w:left="360"/>
+        <w:pStyle w:val="Paragrafoelenco"/>
+        <w:numPr>
+          <w:ilvl w:val="0"/>
+          <w:numId w:val="17"/>
+        </w:numPr>
         <w:jc w:val="both"/>
-      </w:pPr>
-      <w:r>
-        <w:t>Asddsaadsdasadsasdasdadsdasadsadsadsadsadssaddasssssssssssssssssssssssssssssssssssssssssssssdsadsa</w:t>
+        <w:rPr>
+          <w:color w:val="000000" w:themeColor="text1"/>
+        </w:rPr>
+      </w:pPr>
+      <w:r>
+        <w:rPr>
+          <w:b/>
+          <w:color w:val="000000" w:themeColor="text1"/>
+        </w:rPr>
+        <w:t>Requisiti non funzionali</w:t>
+      </w:r>
+      <w:r>
+        <w:rPr>
+          <w:b/>
+          <w:color w:val="000000" w:themeColor="text1"/>
+        </w:rPr>
+        <w:t>:</w:t>
+      </w:r>
+      <w:r>
+        <w:rPr>
+          <w:color w:val="000000" w:themeColor="text1"/>
+        </w:rPr>
+        <w:t xml:space="preserve"> descrizione degli aspetti del sistema che ne indicano la qualità come usabilità, affidabilità, prestazioni, aspetti quindi non legati alle funzionalità del sistema. </w:t>
       </w:r>
     </w:p>
     <w:p>
       <w:pPr>
-        <w:ind w:left="360"/>
+        <w:pStyle w:val="Paragrafoelenco"/>
+        <w:numPr>
+          <w:ilvl w:val="0"/>
+          <w:numId w:val="17"/>
+        </w:numPr>
         <w:jc w:val="both"/>
-      </w:pPr>
-      <w:r>
-        <w:t>Asddsaadsdasadsasdasdadsdasadsadsadsadsadssaddasssssssssssssssssssssssssssssssssssssssssssssdsadsa</w:t>
+        <w:rPr>
+          <w:color w:val="000000" w:themeColor="text1"/>
+        </w:rPr>
+      </w:pPr>
+      <w:r>
+        <w:rPr>
+          <w:b/>
+          <w:color w:val="000000" w:themeColor="text1"/>
+        </w:rPr>
+        <w:t>Modello del sistema</w:t>
+      </w:r>
+      <w:r>
+        <w:rPr>
+          <w:b/>
+          <w:color w:val="000000" w:themeColor="text1"/>
+        </w:rPr>
+        <w:t xml:space="preserve">: </w:t>
       </w:r>
     </w:p>
     <w:p>
       <w:pPr>
-        <w:ind w:left="360"/>
+        <w:pStyle w:val="Paragrafoelenco"/>
+        <w:numPr>
+          <w:ilvl w:val="0"/>
+          <w:numId w:val="18"/>
+        </w:numPr>
         <w:jc w:val="both"/>
-      </w:pPr>
-      <w:r>
-        <w:t>Asddsaadsdasadsasdasdadsdasadsadsadsadsadssaddasssssssssssssssssssssssssssssssssssssssssssssdsadsa</w:t>
+        <w:rPr>
+          <w:color w:val="000000" w:themeColor="text1"/>
+        </w:rPr>
+      </w:pPr>
+      <w:r>
+        <w:rPr>
+          <w:b/>
+          <w:color w:val="000000" w:themeColor="text1"/>
+        </w:rPr>
+        <w:t xml:space="preserve">Scenari: </w:t>
+      </w:r>
+      <w:r>
+        <w:rPr>
+          <w:color w:val="000000" w:themeColor="text1"/>
+        </w:rPr>
+        <w:t xml:space="preserve">descrizione informale di una singola caratteristica del sistema dal punto di vista dell’utente finale, descrivono cosa gli utenti fanno quando usano il sistema. </w:t>
       </w:r>
     </w:p>
     <w:p>
       <w:pPr>
-        <w:ind w:left="360"/>
+        <w:pStyle w:val="Paragrafoelenco"/>
+        <w:numPr>
+          <w:ilvl w:val="0"/>
+          <w:numId w:val="18"/>
+        </w:numPr>
         <w:jc w:val="both"/>
-      </w:pPr>
-      <w:r>
-        <w:t>Asddsaadsdasadsasdasdadsdasadsadsadsadsadssaddasssssssssssssssssssssssssssssssssssssssssssssdsadsa</w:t>
+        <w:rPr>
+          <w:color w:val="000000" w:themeColor="text1"/>
+        </w:rPr>
+      </w:pPr>
+      <w:r>
+        <w:rPr>
+          <w:b/>
+          <w:color w:val="000000" w:themeColor="text1"/>
+        </w:rPr>
+        <w:t xml:space="preserve">Modello dei casi d’uso: </w:t>
+      </w:r>
+      <w:r>
+        <w:rPr>
+          <w:color w:val="000000" w:themeColor="text1"/>
+        </w:rPr>
+        <w:t xml:space="preserve">descrizione completa delle interazioni che avvengono quando un attore usa il sistema, specificando anche tutti i possibili scenari per quella determinata azione. </w:t>
+      </w:r>
+    </w:p>
+    <w:p>
+      <w:pPr>
+        <w:pStyle w:val="Paragrafoelenco"/>
+        <w:numPr>
+          <w:ilvl w:val="0"/>
+          <w:numId w:val="18"/>
+        </w:numPr>
+        <w:jc w:val="both"/>
+        <w:rPr>
+          <w:color w:val="000000" w:themeColor="text1"/>
+        </w:rPr>
+      </w:pPr>
+      <w:r>
+        <w:rPr>
+          <w:b/>
+          <w:color w:val="000000" w:themeColor="text1"/>
+        </w:rPr>
+        <w:t>Modello ad oggetti:</w:t>
+      </w:r>
+      <w:r>
+        <w:rPr>
+          <w:color w:val="000000" w:themeColor="text1"/>
+        </w:rPr>
+        <w:t xml:space="preserve"> descrizione tramite un class diagram dei singoli oggetti del sistema, delle loro proprietà e delle loro relazioni. </w:t>
+      </w:r>
+    </w:p>
+    <w:p>
+      <w:pPr>
+        <w:pStyle w:val="Paragrafoelenco"/>
+        <w:numPr>
+          <w:ilvl w:val="0"/>
+          <w:numId w:val="18"/>
+        </w:numPr>
+        <w:jc w:val="both"/>
+        <w:rPr>
+          <w:color w:val="000000" w:themeColor="text1"/>
+        </w:rPr>
+      </w:pPr>
+      <w:r>
+        <w:rPr>
+          <w:b/>
+          <w:color w:val="000000" w:themeColor="text1"/>
+        </w:rPr>
+        <w:t xml:space="preserve">Modello dinamico: </w:t>
+      </w:r>
+      <w:r>
+        <w:rPr>
+          <w:color w:val="000000" w:themeColor="text1"/>
+        </w:rPr>
+        <w:t xml:space="preserve">Rappresenta la struttura dinamica del sistema. </w:t>
+      </w:r>
+    </w:p>
+    <w:p>
+      <w:pPr>
+        <w:pStyle w:val="Paragrafoelenco"/>
+        <w:numPr>
+          <w:ilvl w:val="0"/>
+          <w:numId w:val="18"/>
+        </w:numPr>
+        <w:jc w:val="both"/>
+        <w:rPr>
+          <w:color w:val="000000" w:themeColor="text1"/>
+        </w:rPr>
+      </w:pPr>
+      <w:r>
+        <w:rPr>
+          <w:b/>
+          <w:color w:val="000000" w:themeColor="text1"/>
+        </w:rPr>
+        <w:t>Path navigazionali:</w:t>
+      </w:r>
+      <w:r>
+        <w:rPr>
+          <w:color w:val="000000" w:themeColor="text1"/>
+        </w:rPr>
+        <w:t xml:space="preserve"> descrivono il percorso tra le pagine che un attore può compiere </w:t>
+      </w:r>
+      <w:r>
+        <w:rPr>
+          <w:color w:val="000000" w:themeColor="text1"/>
+        </w:rPr>
+        <w:t>al</w:t>
+      </w:r>
+      <w:r>
+        <w:rPr>
+          <w:color w:val="000000" w:themeColor="text1"/>
+        </w:rPr>
+        <w:t>l’</w:t>
+      </w:r>
+      <w:r>
+        <w:rPr>
+          <w:color w:val="000000" w:themeColor="text1"/>
+        </w:rPr>
+        <w:t>interno</w:t>
+      </w:r>
+      <w:r>
+        <w:rPr>
+          <w:color w:val="000000" w:themeColor="text1"/>
+        </w:rPr>
+        <w:t xml:space="preserve"> del sistema. </w:t>
+      </w:r>
+    </w:p>
+    <w:p>
+      <w:pPr>
+        <w:pStyle w:val="Paragrafoelenco"/>
+        <w:numPr>
+          <w:ilvl w:val="0"/>
+          <w:numId w:val="18"/>
+        </w:numPr>
+        <w:jc w:val="both"/>
+        <w:rPr>
+          <w:color w:val="000000" w:themeColor="text1"/>
+        </w:rPr>
+      </w:pPr>
+      <w:r>
+        <w:rPr>
+          <w:b/>
+          <w:color w:val="000000" w:themeColor="text1"/>
+        </w:rPr>
+        <w:t xml:space="preserve">Mock-ups: </w:t>
+      </w:r>
+      <w:r>
+        <w:rPr>
+          <w:color w:val="000000" w:themeColor="text1"/>
+        </w:rPr>
+        <w:t>rappresentazioni dell’interfaccia grafica.</w:t>
       </w:r>
     </w:p>
     <w:p>
@@ -5196,7 +5807,6 @@
           <w:sz w:val="28"/>
           <w:szCs w:val="28"/>
         </w:rPr>
-        <w:lastRenderedPageBreak/>
         <w:t>Attori del sistema</w:t>
       </w:r>
     </w:p>
@@ -5205,6 +5815,7 @@
         <w:rPr>
           <w:noProof/>
         </w:rPr>
+        <w:lastRenderedPageBreak/>
         <w:drawing>
           <wp:inline distT="0" distB="0" distL="0" distR="0" wp14:anchorId="4067E2F6" wp14:editId="13C8A15E">
             <wp:extent cx="6760605" cy="5314950"/>
@@ -5221,7 +5832,7 @@
                     <pic:cNvPicPr/>
                   </pic:nvPicPr>
                   <pic:blipFill>
-                    <a:blip r:embed="rId12">
+                    <a:blip r:embed="rId14">
                       <a:extLst>
                         <a:ext uri="{28A0092B-C50C-407E-A947-70E740481C1C}">
                           <a14:useLocalDpi xmlns:a14="http://schemas.microsoft.com/office/drawing/2010/main" val="0"/>
@@ -5401,6 +6012,9 @@
         <w:t>: rappre</w:t>
       </w:r>
       <w:r>
+        <w:t>se</w:t>
+      </w:r>
+      <w:r>
         <w:t xml:space="preserve">ntano i servizi web esterni delle testate giornalistiche e/o portali informativi che espongono i flussi </w:t>
       </w:r>
       <w:r>
@@ -8142,7 +8756,13 @@
         <w:jc w:val="both"/>
       </w:pPr>
       <w:r>
-        <w:t>In questa sezione sono dettagliati i requisiti non funzionali del sistema, riguardanti l’usabilità, l’affidabilità, le prestazione, la supportability, l’implementazione, le interfacce, l’operabilità, il packaging e la gestione da un punto di vista legale.</w:t>
+        <w:t xml:space="preserve">In questa sezione sono dettagliati i requisiti non funzionali del sistema, riguardanti l’usabilità, l’affidabilità, </w:t>
+      </w:r>
+      <w:r>
+        <w:t>la</w:t>
+      </w:r>
+      <w:r>
+        <w:t xml:space="preserve"> prestazione, la supportability, l’implementazione, le interfacce, l’operabilità, il packaging e la gestione da un punto di vista legale.</w:t>
       </w:r>
     </w:p>
     <w:p>
@@ -8190,7 +8810,7 @@
         <w:tc>
           <w:tcPr>
             <w:cnfStyle w:val="001000000000" w:firstRow="0" w:lastRow="0" w:firstColumn="1" w:lastColumn="0" w:oddVBand="0" w:evenVBand="0" w:oddHBand="0" w:evenHBand="0" w:firstRowFirstColumn="0" w:firstRowLastColumn="0" w:lastRowFirstColumn="0" w:lastRowLastColumn="0"/>
-            <w:tcW w:w="1733" w:type="dxa"/>
+            <w:tcW w:w="1745" w:type="dxa"/>
             <w:vAlign w:val="center"/>
           </w:tcPr>
           <w:p>
@@ -8212,7 +8832,7 @@
         </w:tc>
         <w:tc>
           <w:tcPr>
-            <w:tcW w:w="1948" w:type="dxa"/>
+            <w:tcW w:w="1945" w:type="dxa"/>
             <w:vAlign w:val="center"/>
           </w:tcPr>
           <w:p>
@@ -8235,7 +8855,7 @@
         </w:tc>
         <w:tc>
           <w:tcPr>
-            <w:tcW w:w="3510" w:type="dxa"/>
+            <w:tcW w:w="3504" w:type="dxa"/>
             <w:vAlign w:val="center"/>
           </w:tcPr>
           <w:p>
@@ -8258,7 +8878,7 @@
         </w:tc>
         <w:tc>
           <w:tcPr>
-            <w:tcW w:w="1824" w:type="dxa"/>
+            <w:tcW w:w="1822" w:type="dxa"/>
             <w:vAlign w:val="center"/>
           </w:tcPr>
           <w:p>
@@ -8281,7 +8901,7 @@
         </w:tc>
         <w:tc>
           <w:tcPr>
-            <w:tcW w:w="1521" w:type="dxa"/>
+            <w:tcW w:w="1520" w:type="dxa"/>
             <w:vAlign w:val="center"/>
           </w:tcPr>
           <w:p>
@@ -8311,18 +8931,27 @@
         <w:tc>
           <w:tcPr>
             <w:cnfStyle w:val="001000000000" w:firstRow="0" w:lastRow="0" w:firstColumn="1" w:lastColumn="0" w:oddVBand="0" w:evenVBand="0" w:oddHBand="0" w:evenHBand="0" w:firstRowFirstColumn="0" w:firstRowLastColumn="0" w:lastRowFirstColumn="0" w:lastRowLastColumn="0"/>
-            <w:tcW w:w="1733" w:type="dxa"/>
-            <w:vAlign w:val="center"/>
-          </w:tcPr>
-          <w:p>
-            <w:pPr>
-              <w:jc w:val="center"/>
-            </w:pPr>
-          </w:p>
-        </w:tc>
-        <w:tc>
-          <w:tcPr>
-            <w:tcW w:w="1948" w:type="dxa"/>
+            <w:tcW w:w="1745" w:type="dxa"/>
+            <w:vAlign w:val="center"/>
+          </w:tcPr>
+          <w:p>
+            <w:pPr>
+              <w:jc w:val="center"/>
+            </w:pPr>
+            <w:r>
+              <w:t>RNF_U_</w:t>
+            </w:r>
+            <w:r>
+              <w:t>0</w:t>
+            </w:r>
+            <w:r>
+              <w:t>1</w:t>
+            </w:r>
+          </w:p>
+        </w:tc>
+        <w:tc>
+          <w:tcPr>
+            <w:tcW w:w="1945" w:type="dxa"/>
             <w:vAlign w:val="center"/>
           </w:tcPr>
           <w:p>
@@ -8330,11 +8959,20 @@
               <w:jc w:val="center"/>
               <w:cnfStyle w:val="000000100000" w:firstRow="0" w:lastRow="0" w:firstColumn="0" w:lastColumn="0" w:oddVBand="0" w:evenVBand="0" w:oddHBand="1" w:evenHBand="0" w:firstRowFirstColumn="0" w:firstRowLastColumn="0" w:lastRowFirstColumn="0" w:lastRowLastColumn="0"/>
             </w:pPr>
-          </w:p>
-        </w:tc>
-        <w:tc>
-          <w:tcPr>
-            <w:tcW w:w="3510" w:type="dxa"/>
+            <w:r>
+              <w:t>Fa</w:t>
+            </w:r>
+            <w:r>
+              <w:t>ci</w:t>
+            </w:r>
+            <w:r>
+              <w:t>lità d’utilizzo</w:t>
+            </w:r>
+          </w:p>
+        </w:tc>
+        <w:tc>
+          <w:tcPr>
+            <w:tcW w:w="3504" w:type="dxa"/>
             <w:vAlign w:val="center"/>
           </w:tcPr>
           <w:p>
@@ -8342,11 +8980,29 @@
               <w:jc w:val="center"/>
               <w:cnfStyle w:val="000000100000" w:firstRow="0" w:lastRow="0" w:firstColumn="0" w:lastColumn="0" w:oddVBand="0" w:evenVBand="0" w:oddHBand="1" w:evenHBand="0" w:firstRowFirstColumn="0" w:firstRowLastColumn="0" w:lastRowFirstColumn="0" w:lastRowLastColumn="0"/>
             </w:pPr>
-          </w:p>
-        </w:tc>
-        <w:tc>
-          <w:tcPr>
-            <w:tcW w:w="1824" w:type="dxa"/>
+            <w:r>
+              <w:t>Il sistema deve</w:t>
+            </w:r>
+            <w:r>
+              <w:t xml:space="preserve"> essere</w:t>
+            </w:r>
+            <w:r>
+              <w:t xml:space="preserve"> semplice </w:t>
+            </w:r>
+            <w:r>
+              <w:t xml:space="preserve">e </w:t>
+            </w:r>
+            <w:r>
+              <w:t xml:space="preserve">intuitiva </w:t>
+            </w:r>
+            <w:r>
+              <w:t>per gli utenti anche meno esperti</w:t>
+            </w:r>
+          </w:p>
+        </w:tc>
+        <w:tc>
+          <w:tcPr>
+            <w:tcW w:w="1822" w:type="dxa"/>
             <w:vAlign w:val="center"/>
           </w:tcPr>
           <w:p>
@@ -8354,11 +9010,14 @@
               <w:jc w:val="center"/>
               <w:cnfStyle w:val="000000100000" w:firstRow="0" w:lastRow="0" w:firstColumn="0" w:lastColumn="0" w:oddVBand="0" w:evenVBand="0" w:oddHBand="1" w:evenHBand="0" w:firstRowFirstColumn="0" w:firstRowLastColumn="0" w:lastRowFirstColumn="0" w:lastRowLastColumn="0"/>
             </w:pPr>
-          </w:p>
-        </w:tc>
-        <w:tc>
-          <w:tcPr>
-            <w:tcW w:w="1521" w:type="dxa"/>
+            <w:r>
+              <w:t>Elevata</w:t>
+            </w:r>
+          </w:p>
+        </w:tc>
+        <w:tc>
+          <w:tcPr>
+            <w:tcW w:w="1520" w:type="dxa"/>
             <w:vAlign w:val="center"/>
           </w:tcPr>
           <w:p>
@@ -8366,6 +9025,9 @@
               <w:jc w:val="center"/>
               <w:cnfStyle w:val="000000100000" w:firstRow="0" w:lastRow="0" w:firstColumn="0" w:lastColumn="0" w:oddVBand="0" w:evenVBand="0" w:oddHBand="1" w:evenHBand="0" w:firstRowFirstColumn="0" w:firstRowLastColumn="0" w:lastRowFirstColumn="0" w:lastRowLastColumn="0"/>
             </w:pPr>
+            <w:r>
+              <w:t>Media</w:t>
+            </w:r>
           </w:p>
         </w:tc>
       </w:tr>
@@ -8376,30 +9038,51 @@
         <w:tc>
           <w:tcPr>
             <w:cnfStyle w:val="001000000000" w:firstRow="0" w:lastRow="0" w:firstColumn="1" w:lastColumn="0" w:oddVBand="0" w:evenVBand="0" w:oddHBand="0" w:evenHBand="0" w:firstRowFirstColumn="0" w:firstRowLastColumn="0" w:lastRowFirstColumn="0" w:lastRowLastColumn="0"/>
-            <w:tcW w:w="1733" w:type="dxa"/>
-            <w:vAlign w:val="center"/>
-          </w:tcPr>
-          <w:p>
-            <w:pPr>
-              <w:jc w:val="center"/>
-            </w:pPr>
-          </w:p>
-        </w:tc>
-        <w:tc>
-          <w:tcPr>
-            <w:tcW w:w="1948" w:type="dxa"/>
-            <w:vAlign w:val="center"/>
-          </w:tcPr>
-          <w:p>
-            <w:pPr>
+            <w:tcW w:w="1745" w:type="dxa"/>
+            <w:vAlign w:val="center"/>
+          </w:tcPr>
+          <w:p>
+            <w:pPr>
+              <w:jc w:val="center"/>
+            </w:pPr>
+            <w:r>
+              <w:t>RNF_U_</w:t>
+            </w:r>
+            <w:r>
+              <w:t>0</w:t>
+            </w:r>
+            <w:r>
+              <w:t>2</w:t>
+            </w:r>
+          </w:p>
+        </w:tc>
+        <w:tc>
+          <w:tcPr>
+            <w:tcW w:w="1945" w:type="dxa"/>
+            <w:vAlign w:val="center"/>
+          </w:tcPr>
+          <w:p>
+            <w:pPr>
+              <w:pStyle w:val="Default"/>
               <w:jc w:val="center"/>
               <w:cnfStyle w:val="000000000000" w:firstRow="0" w:lastRow="0" w:firstColumn="0" w:lastColumn="0" w:oddVBand="0" w:evenVBand="0" w:oddHBand="0" w:evenHBand="0" w:firstRowFirstColumn="0" w:firstRowLastColumn="0" w:lastRowFirstColumn="0" w:lastRowLastColumn="0"/>
-            </w:pPr>
-          </w:p>
-        </w:tc>
-        <w:tc>
-          <w:tcPr>
-            <w:tcW w:w="3510" w:type="dxa"/>
+              <w:rPr>
+                <w:rFonts w:ascii="Calibri" w:hAnsi="Calibri" w:cs="Calibri"/>
+                <w:color w:val="0F4761" w:themeColor="accent1" w:themeShade="BF"/>
+              </w:rPr>
+            </w:pPr>
+            <w:r>
+              <w:rPr>
+                <w:rFonts w:ascii="Calibri" w:hAnsi="Calibri" w:cs="Calibri"/>
+                <w:color w:val="0F4761" w:themeColor="accent1" w:themeShade="BF"/>
+              </w:rPr>
+              <w:t>Interfaccia intuitiva</w:t>
+            </w:r>
+          </w:p>
+        </w:tc>
+        <w:tc>
+          <w:tcPr>
+            <w:tcW w:w="3504" w:type="dxa"/>
             <w:vAlign w:val="center"/>
           </w:tcPr>
           <w:p>
@@ -8407,11 +9090,38 @@
               <w:jc w:val="center"/>
               <w:cnfStyle w:val="000000000000" w:firstRow="0" w:lastRow="0" w:firstColumn="0" w:lastColumn="0" w:oddVBand="0" w:evenVBand="0" w:oddHBand="0" w:evenHBand="0" w:firstRowFirstColumn="0" w:firstRowLastColumn="0" w:lastRowFirstColumn="0" w:lastRowLastColumn="0"/>
             </w:pPr>
-          </w:p>
-        </w:tc>
-        <w:tc>
-          <w:tcPr>
-            <w:tcW w:w="1824" w:type="dxa"/>
+            <w:r>
+              <w:t xml:space="preserve">L’interfaccia </w:t>
+            </w:r>
+            <w:r>
+              <w:t xml:space="preserve">utente </w:t>
+            </w:r>
+            <w:r>
+              <w:t xml:space="preserve">deve </w:t>
+            </w:r>
+            <w:r>
+              <w:t xml:space="preserve">permettere di eseguire azioni in modo </w:t>
+            </w:r>
+            <w:r>
+              <w:t xml:space="preserve">semplice in modo da </w:t>
+            </w:r>
+            <w:r>
+              <w:t>r</w:t>
+            </w:r>
+            <w:r>
+              <w:t>en</w:t>
+            </w:r>
+            <w:r>
+              <w:t xml:space="preserve">dere esplicita </w:t>
+            </w:r>
+            <w:r>
+              <w:t>la funzionalità di ogni elemento visuale</w:t>
+            </w:r>
+          </w:p>
+        </w:tc>
+        <w:tc>
+          <w:tcPr>
+            <w:tcW w:w="1822" w:type="dxa"/>
             <w:vAlign w:val="center"/>
           </w:tcPr>
           <w:p>
@@ -8419,11 +9129,14 @@
               <w:jc w:val="center"/>
               <w:cnfStyle w:val="000000000000" w:firstRow="0" w:lastRow="0" w:firstColumn="0" w:lastColumn="0" w:oddVBand="0" w:evenVBand="0" w:oddHBand="0" w:evenHBand="0" w:firstRowFirstColumn="0" w:firstRowLastColumn="0" w:lastRowFirstColumn="0" w:lastRowLastColumn="0"/>
             </w:pPr>
-          </w:p>
-        </w:tc>
-        <w:tc>
-          <w:tcPr>
-            <w:tcW w:w="1521" w:type="dxa"/>
+            <w:r>
+              <w:t>Elevata</w:t>
+            </w:r>
+          </w:p>
+        </w:tc>
+        <w:tc>
+          <w:tcPr>
+            <w:tcW w:w="1520" w:type="dxa"/>
             <w:vAlign w:val="center"/>
           </w:tcPr>
           <w:p>
@@ -8431,6 +9144,9 @@
               <w:jc w:val="center"/>
               <w:cnfStyle w:val="000000000000" w:firstRow="0" w:lastRow="0" w:firstColumn="0" w:lastColumn="0" w:oddVBand="0" w:evenVBand="0" w:oddHBand="0" w:evenHBand="0" w:firstRowFirstColumn="0" w:firstRowLastColumn="0" w:lastRowFirstColumn="0" w:lastRowLastColumn="0"/>
             </w:pPr>
+            <w:r>
+              <w:t>Facile</w:t>
+            </w:r>
           </w:p>
         </w:tc>
       </w:tr>
@@ -8442,18 +9158,27 @@
         <w:tc>
           <w:tcPr>
             <w:cnfStyle w:val="001000000000" w:firstRow="0" w:lastRow="0" w:firstColumn="1" w:lastColumn="0" w:oddVBand="0" w:evenVBand="0" w:oddHBand="0" w:evenHBand="0" w:firstRowFirstColumn="0" w:firstRowLastColumn="0" w:lastRowFirstColumn="0" w:lastRowLastColumn="0"/>
-            <w:tcW w:w="1733" w:type="dxa"/>
-            <w:vAlign w:val="center"/>
-          </w:tcPr>
-          <w:p>
-            <w:pPr>
-              <w:jc w:val="center"/>
-            </w:pPr>
-          </w:p>
-        </w:tc>
-        <w:tc>
-          <w:tcPr>
-            <w:tcW w:w="1948" w:type="dxa"/>
+            <w:tcW w:w="1745" w:type="dxa"/>
+            <w:vAlign w:val="center"/>
+          </w:tcPr>
+          <w:p>
+            <w:pPr>
+              <w:jc w:val="center"/>
+            </w:pPr>
+            <w:r>
+              <w:t>RNF_U_</w:t>
+            </w:r>
+            <w:r>
+              <w:t>0</w:t>
+            </w:r>
+            <w:r>
+              <w:t>3</w:t>
+            </w:r>
+          </w:p>
+        </w:tc>
+        <w:tc>
+          <w:tcPr>
+            <w:tcW w:w="1945" w:type="dxa"/>
             <w:vAlign w:val="center"/>
           </w:tcPr>
           <w:p>
@@ -8461,11 +9186,14 @@
               <w:jc w:val="center"/>
               <w:cnfStyle w:val="000000100000" w:firstRow="0" w:lastRow="0" w:firstColumn="0" w:lastColumn="0" w:oddVBand="0" w:evenVBand="0" w:oddHBand="1" w:evenHBand="0" w:firstRowFirstColumn="0" w:firstRowLastColumn="0" w:lastRowFirstColumn="0" w:lastRowLastColumn="0"/>
             </w:pPr>
-          </w:p>
-        </w:tc>
-        <w:tc>
-          <w:tcPr>
-            <w:tcW w:w="3510" w:type="dxa"/>
+            <w:r>
+              <w:t>Feedback esplicito</w:t>
+            </w:r>
+          </w:p>
+        </w:tc>
+        <w:tc>
+          <w:tcPr>
+            <w:tcW w:w="3504" w:type="dxa"/>
             <w:vAlign w:val="center"/>
           </w:tcPr>
           <w:p>
@@ -8473,11 +9201,23 @@
               <w:jc w:val="center"/>
               <w:cnfStyle w:val="000000100000" w:firstRow="0" w:lastRow="0" w:firstColumn="0" w:lastColumn="0" w:oddVBand="0" w:evenVBand="0" w:oddHBand="1" w:evenHBand="0" w:firstRowFirstColumn="0" w:firstRowLastColumn="0" w:lastRowFirstColumn="0" w:lastRowLastColumn="0"/>
             </w:pPr>
-          </w:p>
-        </w:tc>
-        <w:tc>
-          <w:tcPr>
-            <w:tcW w:w="1824" w:type="dxa"/>
+            <w:r>
+              <w:t>Ogni volta che l’utente fa un’azione all’interno della piattaforma</w:t>
+            </w:r>
+            <w:r>
+              <w:t xml:space="preserve">, il sistema </w:t>
+            </w:r>
+            <w:r>
+              <w:t xml:space="preserve">deve comunicare un feedback </w:t>
+            </w:r>
+            <w:r>
+              <w:t>ben interpretabile.</w:t>
+            </w:r>
+          </w:p>
+        </w:tc>
+        <w:tc>
+          <w:tcPr>
+            <w:tcW w:w="1822" w:type="dxa"/>
             <w:vAlign w:val="center"/>
           </w:tcPr>
           <w:p>
@@ -8485,11 +9225,14 @@
               <w:jc w:val="center"/>
               <w:cnfStyle w:val="000000100000" w:firstRow="0" w:lastRow="0" w:firstColumn="0" w:lastColumn="0" w:oddVBand="0" w:evenVBand="0" w:oddHBand="1" w:evenHBand="0" w:firstRowFirstColumn="0" w:firstRowLastColumn="0" w:lastRowFirstColumn="0" w:lastRowLastColumn="0"/>
             </w:pPr>
-          </w:p>
-        </w:tc>
-        <w:tc>
-          <w:tcPr>
-            <w:tcW w:w="1521" w:type="dxa"/>
+            <w:r>
+              <w:t xml:space="preserve">Elevata </w:t>
+            </w:r>
+          </w:p>
+        </w:tc>
+        <w:tc>
+          <w:tcPr>
+            <w:tcW w:w="1520" w:type="dxa"/>
             <w:vAlign w:val="center"/>
           </w:tcPr>
           <w:p>
@@ -8497,6 +9240,95 @@
               <w:jc w:val="center"/>
               <w:cnfStyle w:val="000000100000" w:firstRow="0" w:lastRow="0" w:firstColumn="0" w:lastColumn="0" w:oddVBand="0" w:evenVBand="0" w:oddHBand="1" w:evenHBand="0" w:firstRowFirstColumn="0" w:firstRowLastColumn="0" w:lastRowFirstColumn="0" w:lastRowLastColumn="0"/>
             </w:pPr>
+            <w:r>
+              <w:t>Facile</w:t>
+            </w:r>
+          </w:p>
+        </w:tc>
+      </w:tr>
+      <w:tr>
+        <w:trPr>
+          <w:trHeight w:val="733"/>
+        </w:trPr>
+        <w:tc>
+          <w:tcPr>
+            <w:cnfStyle w:val="001000000000" w:firstRow="0" w:lastRow="0" w:firstColumn="1" w:lastColumn="0" w:oddVBand="0" w:evenVBand="0" w:oddHBand="0" w:evenHBand="0" w:firstRowFirstColumn="0" w:firstRowLastColumn="0" w:lastRowFirstColumn="0" w:lastRowLastColumn="0"/>
+            <w:tcW w:w="1745" w:type="dxa"/>
+            <w:vAlign w:val="center"/>
+          </w:tcPr>
+          <w:p>
+            <w:pPr>
+              <w:jc w:val="center"/>
+            </w:pPr>
+            <w:r>
+              <w:t>RNF_U_</w:t>
+            </w:r>
+            <w:r>
+              <w:t>0</w:t>
+            </w:r>
+            <w:r>
+              <w:t>4</w:t>
+            </w:r>
+          </w:p>
+        </w:tc>
+        <w:tc>
+          <w:tcPr>
+            <w:tcW w:w="1945" w:type="dxa"/>
+            <w:vAlign w:val="center"/>
+          </w:tcPr>
+          <w:p>
+            <w:pPr>
+              <w:jc w:val="center"/>
+              <w:cnfStyle w:val="000000000000" w:firstRow="0" w:lastRow="0" w:firstColumn="0" w:lastColumn="0" w:oddVBand="0" w:evenVBand="0" w:oddHBand="0" w:evenHBand="0" w:firstRowFirstColumn="0" w:firstRowLastColumn="0" w:lastRowFirstColumn="0" w:lastRowLastColumn="0"/>
+            </w:pPr>
+            <w:r>
+              <w:t>Immediatezza d’utilizzo</w:t>
+            </w:r>
+          </w:p>
+        </w:tc>
+        <w:tc>
+          <w:tcPr>
+            <w:tcW w:w="3504" w:type="dxa"/>
+            <w:vAlign w:val="center"/>
+          </w:tcPr>
+          <w:p>
+            <w:pPr>
+              <w:jc w:val="center"/>
+              <w:cnfStyle w:val="000000000000" w:firstRow="0" w:lastRow="0" w:firstColumn="0" w:lastColumn="0" w:oddVBand="0" w:evenVBand="0" w:oddHBand="0" w:evenHBand="0" w:firstRowFirstColumn="0" w:firstRowLastColumn="0" w:lastRowFirstColumn="0" w:lastRowLastColumn="0"/>
+            </w:pPr>
+            <w:r>
+              <w:t>Il sistema deve consentire un utilizzo immediato della piattaforma, anche senza che l’utente debba consultare alcuna documentazione</w:t>
+            </w:r>
+          </w:p>
+        </w:tc>
+        <w:tc>
+          <w:tcPr>
+            <w:tcW w:w="1822" w:type="dxa"/>
+            <w:vAlign w:val="center"/>
+          </w:tcPr>
+          <w:p>
+            <w:pPr>
+              <w:jc w:val="center"/>
+              <w:cnfStyle w:val="000000000000" w:firstRow="0" w:lastRow="0" w:firstColumn="0" w:lastColumn="0" w:oddVBand="0" w:evenVBand="0" w:oddHBand="0" w:evenHBand="0" w:firstRowFirstColumn="0" w:firstRowLastColumn="0" w:lastRowFirstColumn="0" w:lastRowLastColumn="0"/>
+            </w:pPr>
+            <w:r>
+              <w:t>Elevata</w:t>
+            </w:r>
+          </w:p>
+        </w:tc>
+        <w:tc>
+          <w:tcPr>
+            <w:tcW w:w="1520" w:type="dxa"/>
+            <w:vAlign w:val="center"/>
+          </w:tcPr>
+          <w:p>
+            <w:pPr>
+              <w:jc w:val="center"/>
+              <w:cnfStyle w:val="000000000000" w:firstRow="0" w:lastRow="0" w:firstColumn="0" w:lastColumn="0" w:oddVBand="0" w:evenVBand="0" w:oddHBand="0" w:evenHBand="0" w:firstRowFirstColumn="0" w:firstRowLastColumn="0" w:lastRowFirstColumn="0" w:lastRowLastColumn="0"/>
+            </w:pPr>
+            <w:r>
+              <w:t>Media</w:t>
+            </w:r>
           </w:p>
         </w:tc>
       </w:tr>
@@ -8528,6 +9360,7 @@
           <w:sz w:val="32"/>
           <w:szCs w:val="32"/>
         </w:rPr>
+        <w:lastRenderedPageBreak/>
         <w:t>Affidabilità</w:t>
       </w:r>
       <w:bookmarkEnd w:id="18"/>
@@ -8553,7 +9386,7 @@
         <w:tc>
           <w:tcPr>
             <w:cnfStyle w:val="001000000000" w:firstRow="0" w:lastRow="0" w:firstColumn="1" w:lastColumn="0" w:oddVBand="0" w:evenVBand="0" w:oddHBand="0" w:evenHBand="0" w:firstRowFirstColumn="0" w:firstRowLastColumn="0" w:lastRowFirstColumn="0" w:lastRowLastColumn="0"/>
-            <w:tcW w:w="1733" w:type="dxa"/>
+            <w:tcW w:w="1745" w:type="dxa"/>
             <w:vAlign w:val="center"/>
           </w:tcPr>
           <w:p>
@@ -8575,7 +9408,7 @@
         </w:tc>
         <w:tc>
           <w:tcPr>
-            <w:tcW w:w="1948" w:type="dxa"/>
+            <w:tcW w:w="1945" w:type="dxa"/>
             <w:vAlign w:val="center"/>
           </w:tcPr>
           <w:p>
@@ -8598,7 +9431,7 @@
         </w:tc>
         <w:tc>
           <w:tcPr>
-            <w:tcW w:w="3510" w:type="dxa"/>
+            <w:tcW w:w="3504" w:type="dxa"/>
             <w:vAlign w:val="center"/>
           </w:tcPr>
           <w:p>
@@ -8621,7 +9454,7 @@
         </w:tc>
         <w:tc>
           <w:tcPr>
-            <w:tcW w:w="1824" w:type="dxa"/>
+            <w:tcW w:w="1822" w:type="dxa"/>
             <w:vAlign w:val="center"/>
           </w:tcPr>
           <w:p>
@@ -8644,7 +9477,7 @@
         </w:tc>
         <w:tc>
           <w:tcPr>
-            <w:tcW w:w="1521" w:type="dxa"/>
+            <w:tcW w:w="1520" w:type="dxa"/>
             <w:vAlign w:val="center"/>
           </w:tcPr>
           <w:p>
@@ -8674,18 +9507,21 @@
         <w:tc>
           <w:tcPr>
             <w:cnfStyle w:val="001000000000" w:firstRow="0" w:lastRow="0" w:firstColumn="1" w:lastColumn="0" w:oddVBand="0" w:evenVBand="0" w:oddHBand="0" w:evenHBand="0" w:firstRowFirstColumn="0" w:firstRowLastColumn="0" w:lastRowFirstColumn="0" w:lastRowLastColumn="0"/>
-            <w:tcW w:w="1733" w:type="dxa"/>
-            <w:vAlign w:val="center"/>
-          </w:tcPr>
-          <w:p>
-            <w:pPr>
-              <w:jc w:val="center"/>
-            </w:pPr>
-          </w:p>
-        </w:tc>
-        <w:tc>
-          <w:tcPr>
-            <w:tcW w:w="1948" w:type="dxa"/>
+            <w:tcW w:w="1745" w:type="dxa"/>
+            <w:vAlign w:val="center"/>
+          </w:tcPr>
+          <w:p>
+            <w:pPr>
+              <w:jc w:val="center"/>
+            </w:pPr>
+            <w:r>
+              <w:t>RNF_A_1</w:t>
+            </w:r>
+          </w:p>
+        </w:tc>
+        <w:tc>
+          <w:tcPr>
+            <w:tcW w:w="1945" w:type="dxa"/>
             <w:vAlign w:val="center"/>
           </w:tcPr>
           <w:p>
@@ -8693,11 +9529,14 @@
               <w:jc w:val="center"/>
               <w:cnfStyle w:val="000000100000" w:firstRow="0" w:lastRow="0" w:firstColumn="0" w:lastColumn="0" w:oddVBand="0" w:evenVBand="0" w:oddHBand="1" w:evenHBand="0" w:firstRowFirstColumn="0" w:firstRowLastColumn="0" w:lastRowFirstColumn="0" w:lastRowLastColumn="0"/>
             </w:pPr>
-          </w:p>
-        </w:tc>
-        <w:tc>
-          <w:tcPr>
-            <w:tcW w:w="3510" w:type="dxa"/>
+            <w:r>
+              <w:t>Affidabilità delle operazioni</w:t>
+            </w:r>
+          </w:p>
+        </w:tc>
+        <w:tc>
+          <w:tcPr>
+            <w:tcW w:w="3504" w:type="dxa"/>
             <w:vAlign w:val="center"/>
           </w:tcPr>
           <w:p>
@@ -8705,11 +9544,14 @@
               <w:jc w:val="center"/>
               <w:cnfStyle w:val="000000100000" w:firstRow="0" w:lastRow="0" w:firstColumn="0" w:lastColumn="0" w:oddVBand="0" w:evenVBand="0" w:oddHBand="1" w:evenHBand="0" w:firstRowFirstColumn="0" w:firstRowLastColumn="0" w:lastRowFirstColumn="0" w:lastRowLastColumn="0"/>
             </w:pPr>
-          </w:p>
-        </w:tc>
-        <w:tc>
-          <w:tcPr>
-            <w:tcW w:w="1824" w:type="dxa"/>
+            <w:r>
+              <w:t>Il sistema deve garantire che le operazioni avvengano con successo</w:t>
+            </w:r>
+          </w:p>
+        </w:tc>
+        <w:tc>
+          <w:tcPr>
+            <w:tcW w:w="1822" w:type="dxa"/>
             <w:vAlign w:val="center"/>
           </w:tcPr>
           <w:p>
@@ -8717,11 +9559,14 @@
               <w:jc w:val="center"/>
               <w:cnfStyle w:val="000000100000" w:firstRow="0" w:lastRow="0" w:firstColumn="0" w:lastColumn="0" w:oddVBand="0" w:evenVBand="0" w:oddHBand="1" w:evenHBand="0" w:firstRowFirstColumn="0" w:firstRowLastColumn="0" w:lastRowFirstColumn="0" w:lastRowLastColumn="0"/>
             </w:pPr>
-          </w:p>
-        </w:tc>
-        <w:tc>
-          <w:tcPr>
-            <w:tcW w:w="1521" w:type="dxa"/>
+            <w:r>
+              <w:t>Elevata</w:t>
+            </w:r>
+          </w:p>
+        </w:tc>
+        <w:tc>
+          <w:tcPr>
+            <w:tcW w:w="1520" w:type="dxa"/>
             <w:vAlign w:val="center"/>
           </w:tcPr>
           <w:p>
@@ -8729,6 +9574,9 @@
               <w:jc w:val="center"/>
               <w:cnfStyle w:val="000000100000" w:firstRow="0" w:lastRow="0" w:firstColumn="0" w:lastColumn="0" w:oddVBand="0" w:evenVBand="0" w:oddHBand="1" w:evenHBand="0" w:firstRowFirstColumn="0" w:firstRowLastColumn="0" w:lastRowFirstColumn="0" w:lastRowLastColumn="0"/>
             </w:pPr>
+            <w:r>
+              <w:t>Media</w:t>
+            </w:r>
           </w:p>
         </w:tc>
       </w:tr>
@@ -8739,18 +9587,21 @@
         <w:tc>
           <w:tcPr>
             <w:cnfStyle w:val="001000000000" w:firstRow="0" w:lastRow="0" w:firstColumn="1" w:lastColumn="0" w:oddVBand="0" w:evenVBand="0" w:oddHBand="0" w:evenHBand="0" w:firstRowFirstColumn="0" w:firstRowLastColumn="0" w:lastRowFirstColumn="0" w:lastRowLastColumn="0"/>
-            <w:tcW w:w="1733" w:type="dxa"/>
-            <w:vAlign w:val="center"/>
-          </w:tcPr>
-          <w:p>
-            <w:pPr>
-              <w:jc w:val="center"/>
-            </w:pPr>
-          </w:p>
-        </w:tc>
-        <w:tc>
-          <w:tcPr>
-            <w:tcW w:w="1948" w:type="dxa"/>
+            <w:tcW w:w="1745" w:type="dxa"/>
+            <w:vAlign w:val="center"/>
+          </w:tcPr>
+          <w:p>
+            <w:pPr>
+              <w:jc w:val="center"/>
+            </w:pPr>
+            <w:r>
+              <w:t>RNF_A_2</w:t>
+            </w:r>
+          </w:p>
+        </w:tc>
+        <w:tc>
+          <w:tcPr>
+            <w:tcW w:w="1945" w:type="dxa"/>
             <w:vAlign w:val="center"/>
           </w:tcPr>
           <w:p>
@@ -8758,11 +9609,14 @@
               <w:jc w:val="center"/>
               <w:cnfStyle w:val="000000000000" w:firstRow="0" w:lastRow="0" w:firstColumn="0" w:lastColumn="0" w:oddVBand="0" w:evenVBand="0" w:oddHBand="0" w:evenHBand="0" w:firstRowFirstColumn="0" w:firstRowLastColumn="0" w:lastRowFirstColumn="0" w:lastRowLastColumn="0"/>
             </w:pPr>
-          </w:p>
-        </w:tc>
-        <w:tc>
-          <w:tcPr>
-            <w:tcW w:w="3510" w:type="dxa"/>
+            <w:r>
+              <w:t>Gestione informazioni sensibili</w:t>
+            </w:r>
+          </w:p>
+        </w:tc>
+        <w:tc>
+          <w:tcPr>
+            <w:tcW w:w="3504" w:type="dxa"/>
             <w:vAlign w:val="center"/>
           </w:tcPr>
           <w:p>
@@ -8770,11 +9624,17 @@
               <w:jc w:val="center"/>
               <w:cnfStyle w:val="000000000000" w:firstRow="0" w:lastRow="0" w:firstColumn="0" w:lastColumn="0" w:oddVBand="0" w:evenVBand="0" w:oddHBand="0" w:evenHBand="0" w:firstRowFirstColumn="0" w:firstRowLastColumn="0" w:lastRowFirstColumn="0" w:lastRowLastColumn="0"/>
             </w:pPr>
-          </w:p>
-        </w:tc>
-        <w:tc>
-          <w:tcPr>
-            <w:tcW w:w="1824" w:type="dxa"/>
+            <w:r>
+              <w:t xml:space="preserve">Il sistema deve garantire un alto livello di sicurezza per </w:t>
+            </w:r>
+            <w:r>
+              <w:t>preservare le informazioni sensibili</w:t>
+            </w:r>
+          </w:p>
+        </w:tc>
+        <w:tc>
+          <w:tcPr>
+            <w:tcW w:w="1822" w:type="dxa"/>
             <w:vAlign w:val="center"/>
           </w:tcPr>
           <w:p>
@@ -8782,11 +9642,14 @@
               <w:jc w:val="center"/>
               <w:cnfStyle w:val="000000000000" w:firstRow="0" w:lastRow="0" w:firstColumn="0" w:lastColumn="0" w:oddVBand="0" w:evenVBand="0" w:oddHBand="0" w:evenHBand="0" w:firstRowFirstColumn="0" w:firstRowLastColumn="0" w:lastRowFirstColumn="0" w:lastRowLastColumn="0"/>
             </w:pPr>
-          </w:p>
-        </w:tc>
-        <w:tc>
-          <w:tcPr>
-            <w:tcW w:w="1521" w:type="dxa"/>
+            <w:r>
+              <w:t>Elevata</w:t>
+            </w:r>
+          </w:p>
+        </w:tc>
+        <w:tc>
+          <w:tcPr>
+            <w:tcW w:w="1520" w:type="dxa"/>
             <w:vAlign w:val="center"/>
           </w:tcPr>
           <w:p>
@@ -8794,6 +9657,9 @@
               <w:jc w:val="center"/>
               <w:cnfStyle w:val="000000000000" w:firstRow="0" w:lastRow="0" w:firstColumn="0" w:lastColumn="0" w:oddVBand="0" w:evenVBand="0" w:oddHBand="0" w:evenHBand="0" w:firstRowFirstColumn="0" w:firstRowLastColumn="0" w:lastRowFirstColumn="0" w:lastRowLastColumn="0"/>
             </w:pPr>
+            <w:r>
+              <w:t>Difficile</w:t>
+            </w:r>
           </w:p>
         </w:tc>
       </w:tr>
@@ -8805,18 +9671,21 @@
         <w:tc>
           <w:tcPr>
             <w:cnfStyle w:val="001000000000" w:firstRow="0" w:lastRow="0" w:firstColumn="1" w:lastColumn="0" w:oddVBand="0" w:evenVBand="0" w:oddHBand="0" w:evenHBand="0" w:firstRowFirstColumn="0" w:firstRowLastColumn="0" w:lastRowFirstColumn="0" w:lastRowLastColumn="0"/>
-            <w:tcW w:w="1733" w:type="dxa"/>
-            <w:vAlign w:val="center"/>
-          </w:tcPr>
-          <w:p>
-            <w:pPr>
-              <w:jc w:val="center"/>
-            </w:pPr>
-          </w:p>
-        </w:tc>
-        <w:tc>
-          <w:tcPr>
-            <w:tcW w:w="1948" w:type="dxa"/>
+            <w:tcW w:w="1745" w:type="dxa"/>
+            <w:vAlign w:val="center"/>
+          </w:tcPr>
+          <w:p>
+            <w:pPr>
+              <w:jc w:val="center"/>
+            </w:pPr>
+            <w:r>
+              <w:t>RNF_A_3</w:t>
+            </w:r>
+          </w:p>
+        </w:tc>
+        <w:tc>
+          <w:tcPr>
+            <w:tcW w:w="1945" w:type="dxa"/>
             <w:vAlign w:val="center"/>
           </w:tcPr>
           <w:p>
@@ -8824,11 +9693,14 @@
               <w:jc w:val="center"/>
               <w:cnfStyle w:val="000000100000" w:firstRow="0" w:lastRow="0" w:firstColumn="0" w:lastColumn="0" w:oddVBand="0" w:evenVBand="0" w:oddHBand="1" w:evenHBand="0" w:firstRowFirstColumn="0" w:firstRowLastColumn="0" w:lastRowFirstColumn="0" w:lastRowLastColumn="0"/>
             </w:pPr>
-          </w:p>
-        </w:tc>
-        <w:tc>
-          <w:tcPr>
-            <w:tcW w:w="3510" w:type="dxa"/>
+            <w:r>
+              <w:t>Fallimento di sistema</w:t>
+            </w:r>
+          </w:p>
+        </w:tc>
+        <w:tc>
+          <w:tcPr>
+            <w:tcW w:w="3504" w:type="dxa"/>
             <w:vAlign w:val="center"/>
           </w:tcPr>
           <w:p>
@@ -8836,11 +9708,26 @@
               <w:jc w:val="center"/>
               <w:cnfStyle w:val="000000100000" w:firstRow="0" w:lastRow="0" w:firstColumn="0" w:lastColumn="0" w:oddVBand="0" w:evenVBand="0" w:oddHBand="1" w:evenHBand="0" w:firstRowFirstColumn="0" w:firstRowLastColumn="0" w:lastRowFirstColumn="0" w:lastRowLastColumn="0"/>
             </w:pPr>
-          </w:p>
-        </w:tc>
-        <w:tc>
-          <w:tcPr>
-            <w:tcW w:w="1824" w:type="dxa"/>
+            <w:r>
+              <w:t>In caso di</w:t>
+            </w:r>
+            <w:r>
+              <w:t xml:space="preserve"> fallimento di sistema, la piattaforma deve </w:t>
+            </w:r>
+            <w:r>
+              <w:t>mostrare entro 1 sec un messaggio d’errore</w:t>
+            </w:r>
+            <w:r>
+              <w:t>, fornendo indicazioni guidate per il completamento dell’operazione</w:t>
+            </w:r>
+            <w:r>
+              <w:t xml:space="preserve"> </w:t>
+            </w:r>
+          </w:p>
+        </w:tc>
+        <w:tc>
+          <w:tcPr>
+            <w:tcW w:w="1822" w:type="dxa"/>
             <w:vAlign w:val="center"/>
           </w:tcPr>
           <w:p>
@@ -8848,11 +9735,14 @@
               <w:jc w:val="center"/>
               <w:cnfStyle w:val="000000100000" w:firstRow="0" w:lastRow="0" w:firstColumn="0" w:lastColumn="0" w:oddVBand="0" w:evenVBand="0" w:oddHBand="1" w:evenHBand="0" w:firstRowFirstColumn="0" w:firstRowLastColumn="0" w:lastRowFirstColumn="0" w:lastRowLastColumn="0"/>
             </w:pPr>
-          </w:p>
-        </w:tc>
-        <w:tc>
-          <w:tcPr>
-            <w:tcW w:w="1521" w:type="dxa"/>
+            <w:r>
+              <w:t>Media</w:t>
+            </w:r>
+          </w:p>
+        </w:tc>
+        <w:tc>
+          <w:tcPr>
+            <w:tcW w:w="1520" w:type="dxa"/>
             <w:vAlign w:val="center"/>
           </w:tcPr>
           <w:p>
@@ -8860,6 +9750,180 @@
               <w:jc w:val="center"/>
               <w:cnfStyle w:val="000000100000" w:firstRow="0" w:lastRow="0" w:firstColumn="0" w:lastColumn="0" w:oddVBand="0" w:evenVBand="0" w:oddHBand="1" w:evenHBand="0" w:firstRowFirstColumn="0" w:firstRowLastColumn="0" w:lastRowFirstColumn="0" w:lastRowLastColumn="0"/>
             </w:pPr>
+            <w:r>
+              <w:t>Media</w:t>
+            </w:r>
+          </w:p>
+        </w:tc>
+      </w:tr>
+      <w:tr>
+        <w:trPr>
+          <w:trHeight w:val="733"/>
+        </w:trPr>
+        <w:tc>
+          <w:tcPr>
+            <w:cnfStyle w:val="001000000000" w:firstRow="0" w:lastRow="0" w:firstColumn="1" w:lastColumn="0" w:oddVBand="0" w:evenVBand="0" w:oddHBand="0" w:evenHBand="0" w:firstRowFirstColumn="0" w:firstRowLastColumn="0" w:lastRowFirstColumn="0" w:lastRowLastColumn="0"/>
+            <w:tcW w:w="1745" w:type="dxa"/>
+            <w:vAlign w:val="center"/>
+          </w:tcPr>
+          <w:p>
+            <w:pPr>
+              <w:jc w:val="center"/>
+              <w:rPr>
+                <w:b w:val="0"/>
+                <w:bCs w:val="0"/>
+              </w:rPr>
+            </w:pPr>
+            <w:r>
+              <w:t>RNF_A_4</w:t>
+            </w:r>
+          </w:p>
+        </w:tc>
+        <w:tc>
+          <w:tcPr>
+            <w:tcW w:w="1945" w:type="dxa"/>
+            <w:vAlign w:val="center"/>
+          </w:tcPr>
+          <w:p>
+            <w:pPr>
+              <w:jc w:val="center"/>
+              <w:cnfStyle w:val="000000000000" w:firstRow="0" w:lastRow="0" w:firstColumn="0" w:lastColumn="0" w:oddVBand="0" w:evenVBand="0" w:oddHBand="0" w:evenHBand="0" w:firstRowFirstColumn="0" w:firstRowLastColumn="0" w:lastRowFirstColumn="0" w:lastRowLastColumn="0"/>
+            </w:pPr>
+            <w:r>
+              <w:t>Riavvio di sistema</w:t>
+            </w:r>
+          </w:p>
+        </w:tc>
+        <w:tc>
+          <w:tcPr>
+            <w:tcW w:w="3504" w:type="dxa"/>
+            <w:vAlign w:val="center"/>
+          </w:tcPr>
+          <w:p>
+            <w:pPr>
+              <w:jc w:val="center"/>
+              <w:cnfStyle w:val="000000000000" w:firstRow="0" w:lastRow="0" w:firstColumn="0" w:lastColumn="0" w:oddVBand="0" w:evenVBand="0" w:oddHBand="0" w:evenHBand="0" w:firstRowFirstColumn="0" w:firstRowLastColumn="0" w:lastRowFirstColumn="0" w:lastRowLastColumn="0"/>
+            </w:pPr>
+            <w:r>
+              <w:t>Il sistema deve garantire la preservazione in caso di riavvio imposto</w:t>
+            </w:r>
+          </w:p>
+        </w:tc>
+        <w:tc>
+          <w:tcPr>
+            <w:tcW w:w="1822" w:type="dxa"/>
+            <w:vAlign w:val="center"/>
+          </w:tcPr>
+          <w:p>
+            <w:pPr>
+              <w:jc w:val="center"/>
+              <w:cnfStyle w:val="000000000000" w:firstRow="0" w:lastRow="0" w:firstColumn="0" w:lastColumn="0" w:oddVBand="0" w:evenVBand="0" w:oddHBand="0" w:evenHBand="0" w:firstRowFirstColumn="0" w:firstRowLastColumn="0" w:lastRowFirstColumn="0" w:lastRowLastColumn="0"/>
+            </w:pPr>
+            <w:r>
+              <w:t>Elevata</w:t>
+            </w:r>
+          </w:p>
+        </w:tc>
+        <w:tc>
+          <w:tcPr>
+            <w:tcW w:w="1520" w:type="dxa"/>
+            <w:vAlign w:val="center"/>
+          </w:tcPr>
+          <w:p>
+            <w:pPr>
+              <w:jc w:val="center"/>
+              <w:cnfStyle w:val="000000000000" w:firstRow="0" w:lastRow="0" w:firstColumn="0" w:lastColumn="0" w:oddVBand="0" w:evenVBand="0" w:oddHBand="0" w:evenHBand="0" w:firstRowFirstColumn="0" w:firstRowLastColumn="0" w:lastRowFirstColumn="0" w:lastRowLastColumn="0"/>
+            </w:pPr>
+            <w:r>
+              <w:t>Media</w:t>
+            </w:r>
+          </w:p>
+        </w:tc>
+      </w:tr>
+      <w:tr>
+        <w:trPr>
+          <w:cnfStyle w:val="000000100000" w:firstRow="0" w:lastRow="0" w:firstColumn="0" w:lastColumn="0" w:oddVBand="0" w:evenVBand="0" w:oddHBand="1" w:evenHBand="0" w:firstRowFirstColumn="0" w:firstRowLastColumn="0" w:lastRowFirstColumn="0" w:lastRowLastColumn="0"/>
+          <w:trHeight w:val="733"/>
+        </w:trPr>
+        <w:tc>
+          <w:tcPr>
+            <w:cnfStyle w:val="001000000000" w:firstRow="0" w:lastRow="0" w:firstColumn="1" w:lastColumn="0" w:oddVBand="0" w:evenVBand="0" w:oddHBand="0" w:evenHBand="0" w:firstRowFirstColumn="0" w:firstRowLastColumn="0" w:lastRowFirstColumn="0" w:lastRowLastColumn="0"/>
+            <w:tcW w:w="1745" w:type="dxa"/>
+            <w:vAlign w:val="center"/>
+          </w:tcPr>
+          <w:p>
+            <w:pPr>
+              <w:jc w:val="center"/>
+            </w:pPr>
+            <w:r>
+              <w:t>RNF_A_5</w:t>
+            </w:r>
+          </w:p>
+        </w:tc>
+        <w:tc>
+          <w:tcPr>
+            <w:tcW w:w="1945" w:type="dxa"/>
+            <w:vAlign w:val="center"/>
+          </w:tcPr>
+          <w:p>
+            <w:pPr>
+              <w:jc w:val="center"/>
+              <w:cnfStyle w:val="000000100000" w:firstRow="0" w:lastRow="0" w:firstColumn="0" w:lastColumn="0" w:oddVBand="0" w:evenVBand="0" w:oddHBand="1" w:evenHBand="0" w:firstRowFirstColumn="0" w:firstRowLastColumn="0" w:lastRowFirstColumn="0" w:lastRowLastColumn="0"/>
+            </w:pPr>
+            <w:r>
+              <w:t>Gestione permessi sistema</w:t>
+            </w:r>
+          </w:p>
+        </w:tc>
+        <w:tc>
+          <w:tcPr>
+            <w:tcW w:w="3504" w:type="dxa"/>
+            <w:vAlign w:val="center"/>
+          </w:tcPr>
+          <w:p>
+            <w:pPr>
+              <w:jc w:val="center"/>
+              <w:cnfStyle w:val="000000100000" w:firstRow="0" w:lastRow="0" w:firstColumn="0" w:lastColumn="0" w:oddVBand="0" w:evenVBand="0" w:oddHBand="1" w:evenHBand="0" w:firstRowFirstColumn="0" w:firstRowLastColumn="0" w:lastRowFirstColumn="0" w:lastRowLastColumn="0"/>
+            </w:pPr>
+            <w:r>
+              <w:t>Il sistema</w:t>
+            </w:r>
+            <w:r>
+              <w:t xml:space="preserve"> deve </w:t>
+            </w:r>
+            <w:r>
+              <w:t>implementare una profilazione degli utenti che separi le operazioni consentite a ciascuno</w:t>
+            </w:r>
+          </w:p>
+        </w:tc>
+        <w:tc>
+          <w:tcPr>
+            <w:tcW w:w="1822" w:type="dxa"/>
+            <w:vAlign w:val="center"/>
+          </w:tcPr>
+          <w:p>
+            <w:pPr>
+              <w:jc w:val="center"/>
+              <w:cnfStyle w:val="000000100000" w:firstRow="0" w:lastRow="0" w:firstColumn="0" w:lastColumn="0" w:oddVBand="0" w:evenVBand="0" w:oddHBand="1" w:evenHBand="0" w:firstRowFirstColumn="0" w:firstRowLastColumn="0" w:lastRowFirstColumn="0" w:lastRowLastColumn="0"/>
+            </w:pPr>
+            <w:r>
+              <w:t>Elevata</w:t>
+            </w:r>
+          </w:p>
+        </w:tc>
+        <w:tc>
+          <w:tcPr>
+            <w:tcW w:w="1520" w:type="dxa"/>
+            <w:vAlign w:val="center"/>
+          </w:tcPr>
+          <w:p>
+            <w:pPr>
+              <w:jc w:val="center"/>
+              <w:cnfStyle w:val="000000100000" w:firstRow="0" w:lastRow="0" w:firstColumn="0" w:lastColumn="0" w:oddVBand="0" w:evenVBand="0" w:oddHBand="1" w:evenHBand="0" w:firstRowFirstColumn="0" w:firstRowLastColumn="0" w:lastRowFirstColumn="0" w:lastRowLastColumn="0"/>
+            </w:pPr>
+            <w:r>
+              <w:t>Facile</w:t>
+            </w:r>
           </w:p>
         </w:tc>
       </w:tr>
@@ -8889,7 +9953,6 @@
           <w:sz w:val="32"/>
           <w:szCs w:val="32"/>
         </w:rPr>
-        <w:lastRenderedPageBreak/>
         <w:t>Prestazioni</w:t>
       </w:r>
       <w:bookmarkEnd w:id="19"/>
@@ -10712,7 +11775,7 @@
         <w:tc>
           <w:tcPr>
             <w:cnfStyle w:val="001000000000" w:firstRow="0" w:lastRow="0" w:firstColumn="1" w:lastColumn="0" w:oddVBand="0" w:evenVBand="0" w:oddHBand="0" w:evenHBand="0" w:firstRowFirstColumn="0" w:firstRowLastColumn="0" w:lastRowFirstColumn="0" w:lastRowLastColumn="0"/>
-            <w:tcW w:w="1733" w:type="dxa"/>
+            <w:tcW w:w="1745" w:type="dxa"/>
             <w:vAlign w:val="center"/>
           </w:tcPr>
           <w:p>
@@ -10734,7 +11797,7 @@
         </w:tc>
         <w:tc>
           <w:tcPr>
-            <w:tcW w:w="1948" w:type="dxa"/>
+            <w:tcW w:w="1945" w:type="dxa"/>
             <w:vAlign w:val="center"/>
           </w:tcPr>
           <w:p>
@@ -10757,7 +11820,7 @@
         </w:tc>
         <w:tc>
           <w:tcPr>
-            <w:tcW w:w="3510" w:type="dxa"/>
+            <w:tcW w:w="3504" w:type="dxa"/>
             <w:vAlign w:val="center"/>
           </w:tcPr>
           <w:p>
@@ -10780,7 +11843,7 @@
         </w:tc>
         <w:tc>
           <w:tcPr>
-            <w:tcW w:w="1824" w:type="dxa"/>
+            <w:tcW w:w="1822" w:type="dxa"/>
             <w:vAlign w:val="center"/>
           </w:tcPr>
           <w:p>
@@ -10803,7 +11866,7 @@
         </w:tc>
         <w:tc>
           <w:tcPr>
-            <w:tcW w:w="1521" w:type="dxa"/>
+            <w:tcW w:w="1520" w:type="dxa"/>
             <w:vAlign w:val="center"/>
           </w:tcPr>
           <w:p>
@@ -10833,18 +11896,21 @@
         <w:tc>
           <w:tcPr>
             <w:cnfStyle w:val="001000000000" w:firstRow="0" w:lastRow="0" w:firstColumn="1" w:lastColumn="0" w:oddVBand="0" w:evenVBand="0" w:oddHBand="0" w:evenHBand="0" w:firstRowFirstColumn="0" w:firstRowLastColumn="0" w:lastRowFirstColumn="0" w:lastRowLastColumn="0"/>
-            <w:tcW w:w="1733" w:type="dxa"/>
-            <w:vAlign w:val="center"/>
-          </w:tcPr>
-          <w:p>
-            <w:pPr>
-              <w:jc w:val="center"/>
-            </w:pPr>
-          </w:p>
-        </w:tc>
-        <w:tc>
-          <w:tcPr>
-            <w:tcW w:w="1948" w:type="dxa"/>
+            <w:tcW w:w="1745" w:type="dxa"/>
+            <w:vAlign w:val="center"/>
+          </w:tcPr>
+          <w:p>
+            <w:pPr>
+              <w:jc w:val="center"/>
+            </w:pPr>
+            <w:r>
+              <w:t>RNF_PA_01</w:t>
+            </w:r>
+          </w:p>
+        </w:tc>
+        <w:tc>
+          <w:tcPr>
+            <w:tcW w:w="1945" w:type="dxa"/>
             <w:vAlign w:val="center"/>
           </w:tcPr>
           <w:p>
@@ -10852,11 +11918,14 @@
               <w:jc w:val="center"/>
               <w:cnfStyle w:val="000000100000" w:firstRow="0" w:lastRow="0" w:firstColumn="0" w:lastColumn="0" w:oddVBand="0" w:evenVBand="0" w:oddHBand="1" w:evenHBand="0" w:firstRowFirstColumn="0" w:firstRowLastColumn="0" w:lastRowFirstColumn="0" w:lastRowLastColumn="0"/>
             </w:pPr>
-          </w:p>
-        </w:tc>
-        <w:tc>
-          <w:tcPr>
-            <w:tcW w:w="3510" w:type="dxa"/>
+            <w:r>
+              <w:t>Applicazione Desktop</w:t>
+            </w:r>
+          </w:p>
+        </w:tc>
+        <w:tc>
+          <w:tcPr>
+            <w:tcW w:w="3504" w:type="dxa"/>
             <w:vAlign w:val="center"/>
           </w:tcPr>
           <w:p>
@@ -10864,11 +11933,23 @@
               <w:jc w:val="center"/>
               <w:cnfStyle w:val="000000100000" w:firstRow="0" w:lastRow="0" w:firstColumn="0" w:lastColumn="0" w:oddVBand="0" w:evenVBand="0" w:oddHBand="1" w:evenHBand="0" w:firstRowFirstColumn="0" w:firstRowLastColumn="0" w:lastRowFirstColumn="0" w:lastRowLastColumn="0"/>
             </w:pPr>
-          </w:p>
-        </w:tc>
-        <w:tc>
-          <w:tcPr>
-            <w:tcW w:w="1824" w:type="dxa"/>
+            <w:r>
+              <w:t xml:space="preserve">Il sistema dovrà essere </w:t>
+            </w:r>
+            <w:r>
+              <w:t>distribuito</w:t>
+            </w:r>
+            <w:r>
+              <w:t xml:space="preserve"> tramite un pacchetto di installazione </w:t>
+            </w:r>
+            <w:r>
+              <w:t>eseguibile su sistemi operativi desktop</w:t>
+            </w:r>
+          </w:p>
+        </w:tc>
+        <w:tc>
+          <w:tcPr>
+            <w:tcW w:w="1822" w:type="dxa"/>
             <w:vAlign w:val="center"/>
           </w:tcPr>
           <w:p>
@@ -10876,11 +11957,14 @@
               <w:jc w:val="center"/>
               <w:cnfStyle w:val="000000100000" w:firstRow="0" w:lastRow="0" w:firstColumn="0" w:lastColumn="0" w:oddVBand="0" w:evenVBand="0" w:oddHBand="1" w:evenHBand="0" w:firstRowFirstColumn="0" w:firstRowLastColumn="0" w:lastRowFirstColumn="0" w:lastRowLastColumn="0"/>
             </w:pPr>
-          </w:p>
-        </w:tc>
-        <w:tc>
-          <w:tcPr>
-            <w:tcW w:w="1521" w:type="dxa"/>
+            <w:r>
+              <w:t xml:space="preserve">Elevata </w:t>
+            </w:r>
+          </w:p>
+        </w:tc>
+        <w:tc>
+          <w:tcPr>
+            <w:tcW w:w="1520" w:type="dxa"/>
             <w:vAlign w:val="center"/>
           </w:tcPr>
           <w:p>
@@ -10888,137 +11972,9 @@
               <w:jc w:val="center"/>
               <w:cnfStyle w:val="000000100000" w:firstRow="0" w:lastRow="0" w:firstColumn="0" w:lastColumn="0" w:oddVBand="0" w:evenVBand="0" w:oddHBand="1" w:evenHBand="0" w:firstRowFirstColumn="0" w:firstRowLastColumn="0" w:lastRowFirstColumn="0" w:lastRowLastColumn="0"/>
             </w:pPr>
-          </w:p>
-        </w:tc>
-      </w:tr>
-      <w:tr>
-        <w:trPr>
-          <w:trHeight w:val="733"/>
-        </w:trPr>
-        <w:tc>
-          <w:tcPr>
-            <w:cnfStyle w:val="001000000000" w:firstRow="0" w:lastRow="0" w:firstColumn="1" w:lastColumn="0" w:oddVBand="0" w:evenVBand="0" w:oddHBand="0" w:evenHBand="0" w:firstRowFirstColumn="0" w:firstRowLastColumn="0" w:lastRowFirstColumn="0" w:lastRowLastColumn="0"/>
-            <w:tcW w:w="1733" w:type="dxa"/>
-            <w:vAlign w:val="center"/>
-          </w:tcPr>
-          <w:p>
-            <w:pPr>
-              <w:jc w:val="center"/>
-            </w:pPr>
-          </w:p>
-        </w:tc>
-        <w:tc>
-          <w:tcPr>
-            <w:tcW w:w="1948" w:type="dxa"/>
-            <w:vAlign w:val="center"/>
-          </w:tcPr>
-          <w:p>
-            <w:pPr>
-              <w:jc w:val="center"/>
-              <w:cnfStyle w:val="000000000000" w:firstRow="0" w:lastRow="0" w:firstColumn="0" w:lastColumn="0" w:oddVBand="0" w:evenVBand="0" w:oddHBand="0" w:evenHBand="0" w:firstRowFirstColumn="0" w:firstRowLastColumn="0" w:lastRowFirstColumn="0" w:lastRowLastColumn="0"/>
-            </w:pPr>
-          </w:p>
-        </w:tc>
-        <w:tc>
-          <w:tcPr>
-            <w:tcW w:w="3510" w:type="dxa"/>
-            <w:vAlign w:val="center"/>
-          </w:tcPr>
-          <w:p>
-            <w:pPr>
-              <w:jc w:val="center"/>
-              <w:cnfStyle w:val="000000000000" w:firstRow="0" w:lastRow="0" w:firstColumn="0" w:lastColumn="0" w:oddVBand="0" w:evenVBand="0" w:oddHBand="0" w:evenHBand="0" w:firstRowFirstColumn="0" w:firstRowLastColumn="0" w:lastRowFirstColumn="0" w:lastRowLastColumn="0"/>
-            </w:pPr>
-          </w:p>
-        </w:tc>
-        <w:tc>
-          <w:tcPr>
-            <w:tcW w:w="1824" w:type="dxa"/>
-            <w:vAlign w:val="center"/>
-          </w:tcPr>
-          <w:p>
-            <w:pPr>
-              <w:jc w:val="center"/>
-              <w:cnfStyle w:val="000000000000" w:firstRow="0" w:lastRow="0" w:firstColumn="0" w:lastColumn="0" w:oddVBand="0" w:evenVBand="0" w:oddHBand="0" w:evenHBand="0" w:firstRowFirstColumn="0" w:firstRowLastColumn="0" w:lastRowFirstColumn="0" w:lastRowLastColumn="0"/>
-            </w:pPr>
-          </w:p>
-        </w:tc>
-        <w:tc>
-          <w:tcPr>
-            <w:tcW w:w="1521" w:type="dxa"/>
-            <w:vAlign w:val="center"/>
-          </w:tcPr>
-          <w:p>
-            <w:pPr>
-              <w:jc w:val="center"/>
-              <w:cnfStyle w:val="000000000000" w:firstRow="0" w:lastRow="0" w:firstColumn="0" w:lastColumn="0" w:oddVBand="0" w:evenVBand="0" w:oddHBand="0" w:evenHBand="0" w:firstRowFirstColumn="0" w:firstRowLastColumn="0" w:lastRowFirstColumn="0" w:lastRowLastColumn="0"/>
-            </w:pPr>
-          </w:p>
-        </w:tc>
-      </w:tr>
-      <w:tr>
-        <w:trPr>
-          <w:cnfStyle w:val="000000100000" w:firstRow="0" w:lastRow="0" w:firstColumn="0" w:lastColumn="0" w:oddVBand="0" w:evenVBand="0" w:oddHBand="1" w:evenHBand="0" w:firstRowFirstColumn="0" w:firstRowLastColumn="0" w:lastRowFirstColumn="0" w:lastRowLastColumn="0"/>
-          <w:trHeight w:val="733"/>
-        </w:trPr>
-        <w:tc>
-          <w:tcPr>
-            <w:cnfStyle w:val="001000000000" w:firstRow="0" w:lastRow="0" w:firstColumn="1" w:lastColumn="0" w:oddVBand="0" w:evenVBand="0" w:oddHBand="0" w:evenHBand="0" w:firstRowFirstColumn="0" w:firstRowLastColumn="0" w:lastRowFirstColumn="0" w:lastRowLastColumn="0"/>
-            <w:tcW w:w="1733" w:type="dxa"/>
-            <w:vAlign w:val="center"/>
-          </w:tcPr>
-          <w:p>
-            <w:pPr>
-              <w:jc w:val="center"/>
-            </w:pPr>
-          </w:p>
-        </w:tc>
-        <w:tc>
-          <w:tcPr>
-            <w:tcW w:w="1948" w:type="dxa"/>
-            <w:vAlign w:val="center"/>
-          </w:tcPr>
-          <w:p>
-            <w:pPr>
-              <w:jc w:val="center"/>
-              <w:cnfStyle w:val="000000100000" w:firstRow="0" w:lastRow="0" w:firstColumn="0" w:lastColumn="0" w:oddVBand="0" w:evenVBand="0" w:oddHBand="1" w:evenHBand="0" w:firstRowFirstColumn="0" w:firstRowLastColumn="0" w:lastRowFirstColumn="0" w:lastRowLastColumn="0"/>
-            </w:pPr>
-          </w:p>
-        </w:tc>
-        <w:tc>
-          <w:tcPr>
-            <w:tcW w:w="3510" w:type="dxa"/>
-            <w:vAlign w:val="center"/>
-          </w:tcPr>
-          <w:p>
-            <w:pPr>
-              <w:jc w:val="center"/>
-              <w:cnfStyle w:val="000000100000" w:firstRow="0" w:lastRow="0" w:firstColumn="0" w:lastColumn="0" w:oddVBand="0" w:evenVBand="0" w:oddHBand="1" w:evenHBand="0" w:firstRowFirstColumn="0" w:firstRowLastColumn="0" w:lastRowFirstColumn="0" w:lastRowLastColumn="0"/>
-            </w:pPr>
-          </w:p>
-        </w:tc>
-        <w:tc>
-          <w:tcPr>
-            <w:tcW w:w="1824" w:type="dxa"/>
-            <w:vAlign w:val="center"/>
-          </w:tcPr>
-          <w:p>
-            <w:pPr>
-              <w:jc w:val="center"/>
-              <w:cnfStyle w:val="000000100000" w:firstRow="0" w:lastRow="0" w:firstColumn="0" w:lastColumn="0" w:oddVBand="0" w:evenVBand="0" w:oddHBand="1" w:evenHBand="0" w:firstRowFirstColumn="0" w:firstRowLastColumn="0" w:lastRowFirstColumn="0" w:lastRowLastColumn="0"/>
-            </w:pPr>
-          </w:p>
-        </w:tc>
-        <w:tc>
-          <w:tcPr>
-            <w:tcW w:w="1521" w:type="dxa"/>
-            <w:vAlign w:val="center"/>
-          </w:tcPr>
-          <w:p>
-            <w:pPr>
-              <w:jc w:val="center"/>
-              <w:cnfStyle w:val="000000100000" w:firstRow="0" w:lastRow="0" w:firstColumn="0" w:lastColumn="0" w:oddVBand="0" w:evenVBand="0" w:oddHBand="1" w:evenHBand="0" w:firstRowFirstColumn="0" w:firstRowLastColumn="0" w:lastRowFirstColumn="0" w:lastRowLastColumn="0"/>
-            </w:pPr>
+            <w:r>
+              <w:t>Facile</w:t>
+            </w:r>
           </w:p>
         </w:tc>
       </w:tr>
@@ -11381,9 +12337,10 @@
       </w:tr>
     </w:tbl>
     <w:p/>
+    <w:p/>
     <w:sectPr>
-      <w:headerReference w:type="default" r:id="rId13"/>
-      <w:footerReference w:type="default" r:id="rId14"/>
+      <w:headerReference w:type="default" r:id="rId15"/>
+      <w:footerReference w:type="default" r:id="rId16"/>
       <w:pgSz w:w="11906" w:h="16838"/>
       <w:pgMar w:top="720" w:right="720" w:bottom="720" w:left="720" w:header="794" w:footer="227" w:gutter="0"/>
       <w:cols w:space="708"/>
@@ -11845,6 +12802,119 @@
     </w:lvl>
   </w:abstractNum>
   <w:abstractNum w:abstractNumId="1" w15:restartNumberingAfterBreak="0">
+    <w:nsid w:val="030748EE"/>
+    <w:multiLevelType w:val="hybridMultilevel"/>
+    <w:tmpl w:val="4830A670"/>
+    <w:lvl w:ilvl="0" w:tplc="04100001">
+      <w:start w:val="1"/>
+      <w:numFmt w:val="bullet"/>
+      <w:lvlText w:val=""/>
+      <w:lvlJc w:val="left"/>
+      <w:pPr>
+        <w:ind w:left="720" w:hanging="360"/>
+      </w:pPr>
+      <w:rPr>
+        <w:rFonts w:ascii="Symbol" w:hAnsi="Symbol" w:hint="default"/>
+      </w:rPr>
+    </w:lvl>
+    <w:lvl w:ilvl="1" w:tplc="04100003" w:tentative="1">
+      <w:start w:val="1"/>
+      <w:numFmt w:val="bullet"/>
+      <w:lvlText w:val="o"/>
+      <w:lvlJc w:val="left"/>
+      <w:pPr>
+        <w:ind w:left="1440" w:hanging="360"/>
+      </w:pPr>
+      <w:rPr>
+        <w:rFonts w:ascii="Courier New" w:hAnsi="Courier New" w:cs="Courier New" w:hint="default"/>
+      </w:rPr>
+    </w:lvl>
+    <w:lvl w:ilvl="2" w:tplc="04100005" w:tentative="1">
+      <w:start w:val="1"/>
+      <w:numFmt w:val="bullet"/>
+      <w:lvlText w:val=""/>
+      <w:lvlJc w:val="left"/>
+      <w:pPr>
+        <w:ind w:left="2160" w:hanging="360"/>
+      </w:pPr>
+      <w:rPr>
+        <w:rFonts w:ascii="Wingdings" w:hAnsi="Wingdings" w:hint="default"/>
+      </w:rPr>
+    </w:lvl>
+    <w:lvl w:ilvl="3" w:tplc="04100001" w:tentative="1">
+      <w:start w:val="1"/>
+      <w:numFmt w:val="bullet"/>
+      <w:lvlText w:val=""/>
+      <w:lvlJc w:val="left"/>
+      <w:pPr>
+        <w:ind w:left="2880" w:hanging="360"/>
+      </w:pPr>
+      <w:rPr>
+        <w:rFonts w:ascii="Symbol" w:hAnsi="Symbol" w:hint="default"/>
+      </w:rPr>
+    </w:lvl>
+    <w:lvl w:ilvl="4" w:tplc="04100003" w:tentative="1">
+      <w:start w:val="1"/>
+      <w:numFmt w:val="bullet"/>
+      <w:lvlText w:val="o"/>
+      <w:lvlJc w:val="left"/>
+      <w:pPr>
+        <w:ind w:left="3600" w:hanging="360"/>
+      </w:pPr>
+      <w:rPr>
+        <w:rFonts w:ascii="Courier New" w:hAnsi="Courier New" w:cs="Courier New" w:hint="default"/>
+      </w:rPr>
+    </w:lvl>
+    <w:lvl w:ilvl="5" w:tplc="04100005" w:tentative="1">
+      <w:start w:val="1"/>
+      <w:numFmt w:val="bullet"/>
+      <w:lvlText w:val=""/>
+      <w:lvlJc w:val="left"/>
+      <w:pPr>
+        <w:ind w:left="4320" w:hanging="360"/>
+      </w:pPr>
+      <w:rPr>
+        <w:rFonts w:ascii="Wingdings" w:hAnsi="Wingdings" w:hint="default"/>
+      </w:rPr>
+    </w:lvl>
+    <w:lvl w:ilvl="6" w:tplc="04100001" w:tentative="1">
+      <w:start w:val="1"/>
+      <w:numFmt w:val="bullet"/>
+      <w:lvlText w:val=""/>
+      <w:lvlJc w:val="left"/>
+      <w:pPr>
+        <w:ind w:left="5040" w:hanging="360"/>
+      </w:pPr>
+      <w:rPr>
+        <w:rFonts w:ascii="Symbol" w:hAnsi="Symbol" w:hint="default"/>
+      </w:rPr>
+    </w:lvl>
+    <w:lvl w:ilvl="7" w:tplc="04100003" w:tentative="1">
+      <w:start w:val="1"/>
+      <w:numFmt w:val="bullet"/>
+      <w:lvlText w:val="o"/>
+      <w:lvlJc w:val="left"/>
+      <w:pPr>
+        <w:ind w:left="5760" w:hanging="360"/>
+      </w:pPr>
+      <w:rPr>
+        <w:rFonts w:ascii="Courier New" w:hAnsi="Courier New" w:cs="Courier New" w:hint="default"/>
+      </w:rPr>
+    </w:lvl>
+    <w:lvl w:ilvl="8" w:tplc="04100005" w:tentative="1">
+      <w:start w:val="1"/>
+      <w:numFmt w:val="bullet"/>
+      <w:lvlText w:val=""/>
+      <w:lvlJc w:val="left"/>
+      <w:pPr>
+        <w:ind w:left="6480" w:hanging="360"/>
+      </w:pPr>
+      <w:rPr>
+        <w:rFonts w:ascii="Wingdings" w:hAnsi="Wingdings" w:hint="default"/>
+      </w:rPr>
+    </w:lvl>
+  </w:abstractNum>
+  <w:abstractNum w:abstractNumId="2" w15:restartNumberingAfterBreak="0">
     <w:nsid w:val="03D52687"/>
     <w:multiLevelType w:val="hybridMultilevel"/>
     <w:tmpl w:val="80B0746A"/>
@@ -11933,7 +13003,7 @@
       </w:pPr>
     </w:lvl>
   </w:abstractNum>
-  <w:abstractNum w:abstractNumId="2" w15:restartNumberingAfterBreak="0">
+  <w:abstractNum w:abstractNumId="3" w15:restartNumberingAfterBreak="0">
     <w:nsid w:val="0D0D4E72"/>
     <w:multiLevelType w:val="hybridMultilevel"/>
     <w:tmpl w:val="42BC9504"/>
@@ -12046,7 +13116,7 @@
       </w:rPr>
     </w:lvl>
   </w:abstractNum>
-  <w:abstractNum w:abstractNumId="3" w15:restartNumberingAfterBreak="0">
+  <w:abstractNum w:abstractNumId="4" w15:restartNumberingAfterBreak="0">
     <w:nsid w:val="10AF3821"/>
     <w:multiLevelType w:val="hybridMultilevel"/>
     <w:tmpl w:val="2BB8998E"/>
@@ -12159,7 +13229,120 @@
       </w:rPr>
     </w:lvl>
   </w:abstractNum>
-  <w:abstractNum w:abstractNumId="4" w15:restartNumberingAfterBreak="0">
+  <w:abstractNum w:abstractNumId="5" w15:restartNumberingAfterBreak="0">
+    <w:nsid w:val="122545A0"/>
+    <w:multiLevelType w:val="hybridMultilevel"/>
+    <w:tmpl w:val="A48074E4"/>
+    <w:lvl w:ilvl="0" w:tplc="04100001">
+      <w:start w:val="1"/>
+      <w:numFmt w:val="bullet"/>
+      <w:lvlText w:val=""/>
+      <w:lvlJc w:val="left"/>
+      <w:pPr>
+        <w:ind w:left="720" w:hanging="360"/>
+      </w:pPr>
+      <w:rPr>
+        <w:rFonts w:ascii="Symbol" w:hAnsi="Symbol" w:hint="default"/>
+      </w:rPr>
+    </w:lvl>
+    <w:lvl w:ilvl="1" w:tplc="04100003" w:tentative="1">
+      <w:start w:val="1"/>
+      <w:numFmt w:val="bullet"/>
+      <w:lvlText w:val="o"/>
+      <w:lvlJc w:val="left"/>
+      <w:pPr>
+        <w:ind w:left="1440" w:hanging="360"/>
+      </w:pPr>
+      <w:rPr>
+        <w:rFonts w:ascii="Courier New" w:hAnsi="Courier New" w:cs="Courier New" w:hint="default"/>
+      </w:rPr>
+    </w:lvl>
+    <w:lvl w:ilvl="2" w:tplc="04100005" w:tentative="1">
+      <w:start w:val="1"/>
+      <w:numFmt w:val="bullet"/>
+      <w:lvlText w:val=""/>
+      <w:lvlJc w:val="left"/>
+      <w:pPr>
+        <w:ind w:left="2160" w:hanging="360"/>
+      </w:pPr>
+      <w:rPr>
+        <w:rFonts w:ascii="Wingdings" w:hAnsi="Wingdings" w:hint="default"/>
+      </w:rPr>
+    </w:lvl>
+    <w:lvl w:ilvl="3" w:tplc="04100001" w:tentative="1">
+      <w:start w:val="1"/>
+      <w:numFmt w:val="bullet"/>
+      <w:lvlText w:val=""/>
+      <w:lvlJc w:val="left"/>
+      <w:pPr>
+        <w:ind w:left="2880" w:hanging="360"/>
+      </w:pPr>
+      <w:rPr>
+        <w:rFonts w:ascii="Symbol" w:hAnsi="Symbol" w:hint="default"/>
+      </w:rPr>
+    </w:lvl>
+    <w:lvl w:ilvl="4" w:tplc="04100003" w:tentative="1">
+      <w:start w:val="1"/>
+      <w:numFmt w:val="bullet"/>
+      <w:lvlText w:val="o"/>
+      <w:lvlJc w:val="left"/>
+      <w:pPr>
+        <w:ind w:left="3600" w:hanging="360"/>
+      </w:pPr>
+      <w:rPr>
+        <w:rFonts w:ascii="Courier New" w:hAnsi="Courier New" w:cs="Courier New" w:hint="default"/>
+      </w:rPr>
+    </w:lvl>
+    <w:lvl w:ilvl="5" w:tplc="04100005" w:tentative="1">
+      <w:start w:val="1"/>
+      <w:numFmt w:val="bullet"/>
+      <w:lvlText w:val=""/>
+      <w:lvlJc w:val="left"/>
+      <w:pPr>
+        <w:ind w:left="4320" w:hanging="360"/>
+      </w:pPr>
+      <w:rPr>
+        <w:rFonts w:ascii="Wingdings" w:hAnsi="Wingdings" w:hint="default"/>
+      </w:rPr>
+    </w:lvl>
+    <w:lvl w:ilvl="6" w:tplc="04100001" w:tentative="1">
+      <w:start w:val="1"/>
+      <w:numFmt w:val="bullet"/>
+      <w:lvlText w:val=""/>
+      <w:lvlJc w:val="left"/>
+      <w:pPr>
+        <w:ind w:left="5040" w:hanging="360"/>
+      </w:pPr>
+      <w:rPr>
+        <w:rFonts w:ascii="Symbol" w:hAnsi="Symbol" w:hint="default"/>
+      </w:rPr>
+    </w:lvl>
+    <w:lvl w:ilvl="7" w:tplc="04100003" w:tentative="1">
+      <w:start w:val="1"/>
+      <w:numFmt w:val="bullet"/>
+      <w:lvlText w:val="o"/>
+      <w:lvlJc w:val="left"/>
+      <w:pPr>
+        <w:ind w:left="5760" w:hanging="360"/>
+      </w:pPr>
+      <w:rPr>
+        <w:rFonts w:ascii="Courier New" w:hAnsi="Courier New" w:cs="Courier New" w:hint="default"/>
+      </w:rPr>
+    </w:lvl>
+    <w:lvl w:ilvl="8" w:tplc="04100005" w:tentative="1">
+      <w:start w:val="1"/>
+      <w:numFmt w:val="bullet"/>
+      <w:lvlText w:val=""/>
+      <w:lvlJc w:val="left"/>
+      <w:pPr>
+        <w:ind w:left="6480" w:hanging="360"/>
+      </w:pPr>
+      <w:rPr>
+        <w:rFonts w:ascii="Wingdings" w:hAnsi="Wingdings" w:hint="default"/>
+      </w:rPr>
+    </w:lvl>
+  </w:abstractNum>
+  <w:abstractNum w:abstractNumId="6" w15:restartNumberingAfterBreak="0">
     <w:nsid w:val="13EA2CBA"/>
     <w:multiLevelType w:val="multilevel"/>
     <w:tmpl w:val="3AC26F22"/>
@@ -12272,7 +13455,7 @@
       </w:rPr>
     </w:lvl>
   </w:abstractNum>
-  <w:abstractNum w:abstractNumId="5" w15:restartNumberingAfterBreak="0">
+  <w:abstractNum w:abstractNumId="7" w15:restartNumberingAfterBreak="0">
     <w:nsid w:val="1405489A"/>
     <w:multiLevelType w:val="multilevel"/>
     <w:tmpl w:val="84C4EE28"/>
@@ -12393,7 +13576,93 @@
       </w:rPr>
     </w:lvl>
   </w:abstractNum>
-  <w:abstractNum w:abstractNumId="6" w15:restartNumberingAfterBreak="0">
+  <w:abstractNum w:abstractNumId="8" w15:restartNumberingAfterBreak="0">
+    <w:nsid w:val="1C82A55F"/>
+    <w:multiLevelType w:val="hybridMultilevel"/>
+    <w:tmpl w:val="FFFFFFFF"/>
+    <w:lvl w:ilvl="0" w:tplc="C1521FDE">
+      <w:start w:val="1"/>
+      <w:numFmt w:val="decimal"/>
+      <w:lvlText w:val="%1."/>
+      <w:lvlJc w:val="left"/>
+      <w:pPr>
+        <w:ind w:left="720" w:hanging="360"/>
+      </w:pPr>
+    </w:lvl>
+    <w:lvl w:ilvl="1" w:tplc="CCA0B326">
+      <w:start w:val="1"/>
+      <w:numFmt w:val="lowerLetter"/>
+      <w:lvlText w:val="%2."/>
+      <w:lvlJc w:val="left"/>
+      <w:pPr>
+        <w:ind w:left="1440" w:hanging="360"/>
+      </w:pPr>
+    </w:lvl>
+    <w:lvl w:ilvl="2" w:tplc="622A5F14">
+      <w:start w:val="1"/>
+      <w:numFmt w:val="lowerRoman"/>
+      <w:lvlText w:val="%3."/>
+      <w:lvlJc w:val="right"/>
+      <w:pPr>
+        <w:ind w:left="2160" w:hanging="180"/>
+      </w:pPr>
+    </w:lvl>
+    <w:lvl w:ilvl="3" w:tplc="F0685F98">
+      <w:start w:val="1"/>
+      <w:numFmt w:val="decimal"/>
+      <w:lvlText w:val="%4."/>
+      <w:lvlJc w:val="left"/>
+      <w:pPr>
+        <w:ind w:left="2880" w:hanging="360"/>
+      </w:pPr>
+    </w:lvl>
+    <w:lvl w:ilvl="4" w:tplc="BE1A6BFC">
+      <w:start w:val="1"/>
+      <w:numFmt w:val="lowerLetter"/>
+      <w:lvlText w:val="%5."/>
+      <w:lvlJc w:val="left"/>
+      <w:pPr>
+        <w:ind w:left="3600" w:hanging="360"/>
+      </w:pPr>
+    </w:lvl>
+    <w:lvl w:ilvl="5" w:tplc="39E090FA">
+      <w:start w:val="1"/>
+      <w:numFmt w:val="lowerRoman"/>
+      <w:lvlText w:val="%6."/>
+      <w:lvlJc w:val="right"/>
+      <w:pPr>
+        <w:ind w:left="4320" w:hanging="180"/>
+      </w:pPr>
+    </w:lvl>
+    <w:lvl w:ilvl="6" w:tplc="678CEE9E">
+      <w:start w:val="1"/>
+      <w:numFmt w:val="decimal"/>
+      <w:lvlText w:val="%7."/>
+      <w:lvlJc w:val="left"/>
+      <w:pPr>
+        <w:ind w:left="5040" w:hanging="360"/>
+      </w:pPr>
+    </w:lvl>
+    <w:lvl w:ilvl="7" w:tplc="C28CEBBA">
+      <w:start w:val="1"/>
+      <w:numFmt w:val="lowerLetter"/>
+      <w:lvlText w:val="%8."/>
+      <w:lvlJc w:val="left"/>
+      <w:pPr>
+        <w:ind w:left="5760" w:hanging="360"/>
+      </w:pPr>
+    </w:lvl>
+    <w:lvl w:ilvl="8" w:tplc="CEAAEC70">
+      <w:start w:val="1"/>
+      <w:numFmt w:val="lowerRoman"/>
+      <w:lvlText w:val="%9."/>
+      <w:lvlJc w:val="right"/>
+      <w:pPr>
+        <w:ind w:left="6480" w:hanging="180"/>
+      </w:pPr>
+    </w:lvl>
+  </w:abstractNum>
+  <w:abstractNum w:abstractNumId="9" w15:restartNumberingAfterBreak="0">
     <w:nsid w:val="27274B4A"/>
     <w:multiLevelType w:val="hybridMultilevel"/>
     <w:tmpl w:val="FFFFFFFF"/>
@@ -12479,7 +13748,7 @@
       </w:pPr>
     </w:lvl>
   </w:abstractNum>
-  <w:abstractNum w:abstractNumId="7" w15:restartNumberingAfterBreak="0">
+  <w:abstractNum w:abstractNumId="10" w15:restartNumberingAfterBreak="0">
     <w:nsid w:val="2CEFDDD7"/>
     <w:multiLevelType w:val="hybridMultilevel"/>
     <w:tmpl w:val="FFFFFFFF"/>
@@ -12565,7 +13834,120 @@
       </w:pPr>
     </w:lvl>
   </w:abstractNum>
-  <w:abstractNum w:abstractNumId="8" w15:restartNumberingAfterBreak="0">
+  <w:abstractNum w:abstractNumId="11" w15:restartNumberingAfterBreak="0">
+    <w:nsid w:val="2F611603"/>
+    <w:multiLevelType w:val="hybridMultilevel"/>
+    <w:tmpl w:val="FFFFFFFF"/>
+    <w:lvl w:ilvl="0" w:tplc="F7C4BBE8">
+      <w:start w:val="1"/>
+      <w:numFmt w:val="bullet"/>
+      <w:lvlText w:val=""/>
+      <w:lvlJc w:val="left"/>
+      <w:pPr>
+        <w:ind w:left="1776" w:hanging="360"/>
+      </w:pPr>
+      <w:rPr>
+        <w:rFonts w:ascii="Symbol" w:hAnsi="Symbol" w:hint="default"/>
+      </w:rPr>
+    </w:lvl>
+    <w:lvl w:ilvl="1" w:tplc="5ACA553A">
+      <w:start w:val="1"/>
+      <w:numFmt w:val="bullet"/>
+      <w:lvlText w:val="o"/>
+      <w:lvlJc w:val="left"/>
+      <w:pPr>
+        <w:ind w:left="2496" w:hanging="360"/>
+      </w:pPr>
+      <w:rPr>
+        <w:rFonts w:ascii="Courier New" w:hAnsi="Courier New" w:hint="default"/>
+      </w:rPr>
+    </w:lvl>
+    <w:lvl w:ilvl="2" w:tplc="0ED08BA6">
+      <w:start w:val="1"/>
+      <w:numFmt w:val="bullet"/>
+      <w:lvlText w:val=""/>
+      <w:lvlJc w:val="left"/>
+      <w:pPr>
+        <w:ind w:left="3216" w:hanging="360"/>
+      </w:pPr>
+      <w:rPr>
+        <w:rFonts w:ascii="Wingdings" w:hAnsi="Wingdings" w:hint="default"/>
+      </w:rPr>
+    </w:lvl>
+    <w:lvl w:ilvl="3" w:tplc="F280C552">
+      <w:start w:val="1"/>
+      <w:numFmt w:val="bullet"/>
+      <w:lvlText w:val=""/>
+      <w:lvlJc w:val="left"/>
+      <w:pPr>
+        <w:ind w:left="3936" w:hanging="360"/>
+      </w:pPr>
+      <w:rPr>
+        <w:rFonts w:ascii="Symbol" w:hAnsi="Symbol" w:hint="default"/>
+      </w:rPr>
+    </w:lvl>
+    <w:lvl w:ilvl="4" w:tplc="6F662962">
+      <w:start w:val="1"/>
+      <w:numFmt w:val="bullet"/>
+      <w:lvlText w:val="o"/>
+      <w:lvlJc w:val="left"/>
+      <w:pPr>
+        <w:ind w:left="4656" w:hanging="360"/>
+      </w:pPr>
+      <w:rPr>
+        <w:rFonts w:ascii="Courier New" w:hAnsi="Courier New" w:hint="default"/>
+      </w:rPr>
+    </w:lvl>
+    <w:lvl w:ilvl="5" w:tplc="E0965DE8">
+      <w:start w:val="1"/>
+      <w:numFmt w:val="bullet"/>
+      <w:lvlText w:val=""/>
+      <w:lvlJc w:val="left"/>
+      <w:pPr>
+        <w:ind w:left="5376" w:hanging="360"/>
+      </w:pPr>
+      <w:rPr>
+        <w:rFonts w:ascii="Wingdings" w:hAnsi="Wingdings" w:hint="default"/>
+      </w:rPr>
+    </w:lvl>
+    <w:lvl w:ilvl="6" w:tplc="1898E4FA">
+      <w:start w:val="1"/>
+      <w:numFmt w:val="bullet"/>
+      <w:lvlText w:val=""/>
+      <w:lvlJc w:val="left"/>
+      <w:pPr>
+        <w:ind w:left="6096" w:hanging="360"/>
+      </w:pPr>
+      <w:rPr>
+        <w:rFonts w:ascii="Symbol" w:hAnsi="Symbol" w:hint="default"/>
+      </w:rPr>
+    </w:lvl>
+    <w:lvl w:ilvl="7" w:tplc="FC6A0F1E">
+      <w:start w:val="1"/>
+      <w:numFmt w:val="bullet"/>
+      <w:lvlText w:val="o"/>
+      <w:lvlJc w:val="left"/>
+      <w:pPr>
+        <w:ind w:left="6816" w:hanging="360"/>
+      </w:pPr>
+      <w:rPr>
+        <w:rFonts w:ascii="Courier New" w:hAnsi="Courier New" w:hint="default"/>
+      </w:rPr>
+    </w:lvl>
+    <w:lvl w:ilvl="8" w:tplc="5A920140">
+      <w:start w:val="1"/>
+      <w:numFmt w:val="bullet"/>
+      <w:lvlText w:val=""/>
+      <w:lvlJc w:val="left"/>
+      <w:pPr>
+        <w:ind w:left="7536" w:hanging="360"/>
+      </w:pPr>
+      <w:rPr>
+        <w:rFonts w:ascii="Wingdings" w:hAnsi="Wingdings" w:hint="default"/>
+      </w:rPr>
+    </w:lvl>
+  </w:abstractNum>
+  <w:abstractNum w:abstractNumId="12" w15:restartNumberingAfterBreak="0">
     <w:nsid w:val="3736587F"/>
     <w:multiLevelType w:val="hybridMultilevel"/>
     <w:tmpl w:val="AE86B764"/>
@@ -12678,7 +14060,7 @@
       </w:rPr>
     </w:lvl>
   </w:abstractNum>
-  <w:abstractNum w:abstractNumId="9" w15:restartNumberingAfterBreak="0">
+  <w:abstractNum w:abstractNumId="13" w15:restartNumberingAfterBreak="0">
     <w:nsid w:val="3D231150"/>
     <w:multiLevelType w:val="hybridMultilevel"/>
     <w:tmpl w:val="FFFFFFFF"/>
@@ -12791,7 +14173,7 @@
       </w:rPr>
     </w:lvl>
   </w:abstractNum>
-  <w:abstractNum w:abstractNumId="10" w15:restartNumberingAfterBreak="0">
+  <w:abstractNum w:abstractNumId="14" w15:restartNumberingAfterBreak="0">
     <w:nsid w:val="3F6F3B6E"/>
     <w:multiLevelType w:val="hybridMultilevel"/>
     <w:tmpl w:val="EDEE82DC"/>
@@ -12904,7 +14286,7 @@
       </w:rPr>
     </w:lvl>
   </w:abstractNum>
-  <w:abstractNum w:abstractNumId="11" w15:restartNumberingAfterBreak="0">
+  <w:abstractNum w:abstractNumId="15" w15:restartNumberingAfterBreak="0">
     <w:nsid w:val="40623021"/>
     <w:multiLevelType w:val="hybridMultilevel"/>
     <w:tmpl w:val="490A56C4"/>
@@ -13017,7 +14399,7 @@
       </w:rPr>
     </w:lvl>
   </w:abstractNum>
-  <w:abstractNum w:abstractNumId="12" w15:restartNumberingAfterBreak="0">
+  <w:abstractNum w:abstractNumId="16" w15:restartNumberingAfterBreak="0">
     <w:nsid w:val="534A076C"/>
     <w:multiLevelType w:val="hybridMultilevel"/>
     <w:tmpl w:val="C0B43FA2"/>
@@ -13130,7 +14512,7 @@
       </w:rPr>
     </w:lvl>
   </w:abstractNum>
-  <w:abstractNum w:abstractNumId="13" w15:restartNumberingAfterBreak="0">
+  <w:abstractNum w:abstractNumId="17" w15:restartNumberingAfterBreak="0">
     <w:nsid w:val="60EB6CF7"/>
     <w:multiLevelType w:val="hybridMultilevel"/>
     <w:tmpl w:val="2CCE602A"/>
@@ -13243,7 +14625,7 @@
       </w:rPr>
     </w:lvl>
   </w:abstractNum>
-  <w:abstractNum w:abstractNumId="14" w15:restartNumberingAfterBreak="0">
+  <w:abstractNum w:abstractNumId="18" w15:restartNumberingAfterBreak="0">
     <w:nsid w:val="685C54E7"/>
     <w:multiLevelType w:val="hybridMultilevel"/>
     <w:tmpl w:val="6B8A2C36"/>
@@ -13332,7 +14714,233 @@
       </w:pPr>
     </w:lvl>
   </w:abstractNum>
-  <w:abstractNum w:abstractNumId="15" w15:restartNumberingAfterBreak="0">
+  <w:abstractNum w:abstractNumId="19" w15:restartNumberingAfterBreak="0">
+    <w:nsid w:val="6BA90B74"/>
+    <w:multiLevelType w:val="hybridMultilevel"/>
+    <w:tmpl w:val="437E933A"/>
+    <w:lvl w:ilvl="0" w:tplc="04100001">
+      <w:start w:val="1"/>
+      <w:numFmt w:val="bullet"/>
+      <w:lvlText w:val=""/>
+      <w:lvlJc w:val="left"/>
+      <w:pPr>
+        <w:ind w:left="720" w:hanging="360"/>
+      </w:pPr>
+      <w:rPr>
+        <w:rFonts w:ascii="Symbol" w:hAnsi="Symbol" w:hint="default"/>
+      </w:rPr>
+    </w:lvl>
+    <w:lvl w:ilvl="1" w:tplc="04100003" w:tentative="1">
+      <w:start w:val="1"/>
+      <w:numFmt w:val="bullet"/>
+      <w:lvlText w:val="o"/>
+      <w:lvlJc w:val="left"/>
+      <w:pPr>
+        <w:ind w:left="1440" w:hanging="360"/>
+      </w:pPr>
+      <w:rPr>
+        <w:rFonts w:ascii="Courier New" w:hAnsi="Courier New" w:cs="Courier New" w:hint="default"/>
+      </w:rPr>
+    </w:lvl>
+    <w:lvl w:ilvl="2" w:tplc="04100005" w:tentative="1">
+      <w:start w:val="1"/>
+      <w:numFmt w:val="bullet"/>
+      <w:lvlText w:val=""/>
+      <w:lvlJc w:val="left"/>
+      <w:pPr>
+        <w:ind w:left="2160" w:hanging="360"/>
+      </w:pPr>
+      <w:rPr>
+        <w:rFonts w:ascii="Wingdings" w:hAnsi="Wingdings" w:hint="default"/>
+      </w:rPr>
+    </w:lvl>
+    <w:lvl w:ilvl="3" w:tplc="04100001" w:tentative="1">
+      <w:start w:val="1"/>
+      <w:numFmt w:val="bullet"/>
+      <w:lvlText w:val=""/>
+      <w:lvlJc w:val="left"/>
+      <w:pPr>
+        <w:ind w:left="2880" w:hanging="360"/>
+      </w:pPr>
+      <w:rPr>
+        <w:rFonts w:ascii="Symbol" w:hAnsi="Symbol" w:hint="default"/>
+      </w:rPr>
+    </w:lvl>
+    <w:lvl w:ilvl="4" w:tplc="04100003" w:tentative="1">
+      <w:start w:val="1"/>
+      <w:numFmt w:val="bullet"/>
+      <w:lvlText w:val="o"/>
+      <w:lvlJc w:val="left"/>
+      <w:pPr>
+        <w:ind w:left="3600" w:hanging="360"/>
+      </w:pPr>
+      <w:rPr>
+        <w:rFonts w:ascii="Courier New" w:hAnsi="Courier New" w:cs="Courier New" w:hint="default"/>
+      </w:rPr>
+    </w:lvl>
+    <w:lvl w:ilvl="5" w:tplc="04100005" w:tentative="1">
+      <w:start w:val="1"/>
+      <w:numFmt w:val="bullet"/>
+      <w:lvlText w:val=""/>
+      <w:lvlJc w:val="left"/>
+      <w:pPr>
+        <w:ind w:left="4320" w:hanging="360"/>
+      </w:pPr>
+      <w:rPr>
+        <w:rFonts w:ascii="Wingdings" w:hAnsi="Wingdings" w:hint="default"/>
+      </w:rPr>
+    </w:lvl>
+    <w:lvl w:ilvl="6" w:tplc="04100001" w:tentative="1">
+      <w:start w:val="1"/>
+      <w:numFmt w:val="bullet"/>
+      <w:lvlText w:val=""/>
+      <w:lvlJc w:val="left"/>
+      <w:pPr>
+        <w:ind w:left="5040" w:hanging="360"/>
+      </w:pPr>
+      <w:rPr>
+        <w:rFonts w:ascii="Symbol" w:hAnsi="Symbol" w:hint="default"/>
+      </w:rPr>
+    </w:lvl>
+    <w:lvl w:ilvl="7" w:tplc="04100003" w:tentative="1">
+      <w:start w:val="1"/>
+      <w:numFmt w:val="bullet"/>
+      <w:lvlText w:val="o"/>
+      <w:lvlJc w:val="left"/>
+      <w:pPr>
+        <w:ind w:left="5760" w:hanging="360"/>
+      </w:pPr>
+      <w:rPr>
+        <w:rFonts w:ascii="Courier New" w:hAnsi="Courier New" w:cs="Courier New" w:hint="default"/>
+      </w:rPr>
+    </w:lvl>
+    <w:lvl w:ilvl="8" w:tplc="04100005" w:tentative="1">
+      <w:start w:val="1"/>
+      <w:numFmt w:val="bullet"/>
+      <w:lvlText w:val=""/>
+      <w:lvlJc w:val="left"/>
+      <w:pPr>
+        <w:ind w:left="6480" w:hanging="360"/>
+      </w:pPr>
+      <w:rPr>
+        <w:rFonts w:ascii="Wingdings" w:hAnsi="Wingdings" w:hint="default"/>
+      </w:rPr>
+    </w:lvl>
+  </w:abstractNum>
+  <w:abstractNum w:abstractNumId="20" w15:restartNumberingAfterBreak="0">
+    <w:nsid w:val="70566B59"/>
+    <w:multiLevelType w:val="hybridMultilevel"/>
+    <w:tmpl w:val="E3A487CE"/>
+    <w:lvl w:ilvl="0" w:tplc="04100001">
+      <w:start w:val="1"/>
+      <w:numFmt w:val="bullet"/>
+      <w:lvlText w:val=""/>
+      <w:lvlJc w:val="left"/>
+      <w:pPr>
+        <w:ind w:left="720" w:hanging="360"/>
+      </w:pPr>
+      <w:rPr>
+        <w:rFonts w:ascii="Symbol" w:hAnsi="Symbol" w:hint="default"/>
+      </w:rPr>
+    </w:lvl>
+    <w:lvl w:ilvl="1" w:tplc="04100003" w:tentative="1">
+      <w:start w:val="1"/>
+      <w:numFmt w:val="bullet"/>
+      <w:lvlText w:val="o"/>
+      <w:lvlJc w:val="left"/>
+      <w:pPr>
+        <w:ind w:left="1440" w:hanging="360"/>
+      </w:pPr>
+      <w:rPr>
+        <w:rFonts w:ascii="Courier New" w:hAnsi="Courier New" w:cs="Courier New" w:hint="default"/>
+      </w:rPr>
+    </w:lvl>
+    <w:lvl w:ilvl="2" w:tplc="04100005" w:tentative="1">
+      <w:start w:val="1"/>
+      <w:numFmt w:val="bullet"/>
+      <w:lvlText w:val=""/>
+      <w:lvlJc w:val="left"/>
+      <w:pPr>
+        <w:ind w:left="2160" w:hanging="360"/>
+      </w:pPr>
+      <w:rPr>
+        <w:rFonts w:ascii="Wingdings" w:hAnsi="Wingdings" w:hint="default"/>
+      </w:rPr>
+    </w:lvl>
+    <w:lvl w:ilvl="3" w:tplc="04100001" w:tentative="1">
+      <w:start w:val="1"/>
+      <w:numFmt w:val="bullet"/>
+      <w:lvlText w:val=""/>
+      <w:lvlJc w:val="left"/>
+      <w:pPr>
+        <w:ind w:left="2880" w:hanging="360"/>
+      </w:pPr>
+      <w:rPr>
+        <w:rFonts w:ascii="Symbol" w:hAnsi="Symbol" w:hint="default"/>
+      </w:rPr>
+    </w:lvl>
+    <w:lvl w:ilvl="4" w:tplc="04100003" w:tentative="1">
+      <w:start w:val="1"/>
+      <w:numFmt w:val="bullet"/>
+      <w:lvlText w:val="o"/>
+      <w:lvlJc w:val="left"/>
+      <w:pPr>
+        <w:ind w:left="3600" w:hanging="360"/>
+      </w:pPr>
+      <w:rPr>
+        <w:rFonts w:ascii="Courier New" w:hAnsi="Courier New" w:cs="Courier New" w:hint="default"/>
+      </w:rPr>
+    </w:lvl>
+    <w:lvl w:ilvl="5" w:tplc="04100005" w:tentative="1">
+      <w:start w:val="1"/>
+      <w:numFmt w:val="bullet"/>
+      <w:lvlText w:val=""/>
+      <w:lvlJc w:val="left"/>
+      <w:pPr>
+        <w:ind w:left="4320" w:hanging="360"/>
+      </w:pPr>
+      <w:rPr>
+        <w:rFonts w:ascii="Wingdings" w:hAnsi="Wingdings" w:hint="default"/>
+      </w:rPr>
+    </w:lvl>
+    <w:lvl w:ilvl="6" w:tplc="04100001" w:tentative="1">
+      <w:start w:val="1"/>
+      <w:numFmt w:val="bullet"/>
+      <w:lvlText w:val=""/>
+      <w:lvlJc w:val="left"/>
+      <w:pPr>
+        <w:ind w:left="5040" w:hanging="360"/>
+      </w:pPr>
+      <w:rPr>
+        <w:rFonts w:ascii="Symbol" w:hAnsi="Symbol" w:hint="default"/>
+      </w:rPr>
+    </w:lvl>
+    <w:lvl w:ilvl="7" w:tplc="04100003" w:tentative="1">
+      <w:start w:val="1"/>
+      <w:numFmt w:val="bullet"/>
+      <w:lvlText w:val="o"/>
+      <w:lvlJc w:val="left"/>
+      <w:pPr>
+        <w:ind w:left="5760" w:hanging="360"/>
+      </w:pPr>
+      <w:rPr>
+        <w:rFonts w:ascii="Courier New" w:hAnsi="Courier New" w:cs="Courier New" w:hint="default"/>
+      </w:rPr>
+    </w:lvl>
+    <w:lvl w:ilvl="8" w:tplc="04100005" w:tentative="1">
+      <w:start w:val="1"/>
+      <w:numFmt w:val="bullet"/>
+      <w:lvlText w:val=""/>
+      <w:lvlJc w:val="left"/>
+      <w:pPr>
+        <w:ind w:left="6480" w:hanging="360"/>
+      </w:pPr>
+      <w:rPr>
+        <w:rFonts w:ascii="Wingdings" w:hAnsi="Wingdings" w:hint="default"/>
+      </w:rPr>
+    </w:lvl>
+  </w:abstractNum>
+  <w:abstractNum w:abstractNumId="21" w15:restartNumberingAfterBreak="0">
     <w:nsid w:val="785F2291"/>
     <w:multiLevelType w:val="hybridMultilevel"/>
     <w:tmpl w:val="F3D82F2C"/>
@@ -13445,52 +15053,70 @@
     </w:lvl>
   </w:abstractNum>
   <w:num w:numId="1" w16cid:durableId="1994989362">
-    <w:abstractNumId w:val="4"/>
+    <w:abstractNumId w:val="6"/>
   </w:num>
   <w:num w:numId="2" w16cid:durableId="409085446">
+    <w:abstractNumId w:val="21"/>
+  </w:num>
+  <w:num w:numId="3" w16cid:durableId="533732137">
+    <w:abstractNumId w:val="3"/>
+  </w:num>
+  <w:num w:numId="4" w16cid:durableId="3670028">
+    <w:abstractNumId w:val="14"/>
+  </w:num>
+  <w:num w:numId="5" w16cid:durableId="541791040">
     <w:abstractNumId w:val="15"/>
   </w:num>
-  <w:num w:numId="3" w16cid:durableId="533732137">
+  <w:num w:numId="6" w16cid:durableId="1046948845">
+    <w:abstractNumId w:val="12"/>
+  </w:num>
+  <w:num w:numId="7" w16cid:durableId="712659655">
+    <w:abstractNumId w:val="17"/>
+  </w:num>
+  <w:num w:numId="8" w16cid:durableId="688676684">
     <w:abstractNumId w:val="2"/>
   </w:num>
-  <w:num w:numId="4" w16cid:durableId="3670028">
-    <w:abstractNumId w:val="10"/>
+  <w:num w:numId="9" w16cid:durableId="492451093">
+    <w:abstractNumId w:val="7"/>
   </w:num>
-  <w:num w:numId="5" w16cid:durableId="541791040">
-    <w:abstractNumId w:val="11"/>
+  <w:num w:numId="10" w16cid:durableId="2108505010">
+    <w:abstractNumId w:val="18"/>
   </w:num>
-  <w:num w:numId="6" w16cid:durableId="1046948845">
-    <w:abstractNumId w:val="8"/>
+  <w:num w:numId="11" w16cid:durableId="409277915">
+    <w:abstractNumId w:val="9"/>
   </w:num>
-  <w:num w:numId="7" w16cid:durableId="712659655">
+  <w:num w:numId="12" w16cid:durableId="1544174685">
     <w:abstractNumId w:val="13"/>
   </w:num>
-  <w:num w:numId="8" w16cid:durableId="688676684">
-    <w:abstractNumId w:val="1"/>
-  </w:num>
-  <w:num w:numId="9" w16cid:durableId="492451093">
-    <w:abstractNumId w:val="5"/>
-  </w:num>
-  <w:num w:numId="10" w16cid:durableId="2108505010">
-    <w:abstractNumId w:val="14"/>
-  </w:num>
-  <w:num w:numId="11" w16cid:durableId="409277915">
-    <w:abstractNumId w:val="6"/>
-  </w:num>
-  <w:num w:numId="12" w16cid:durableId="1544174685">
-    <w:abstractNumId w:val="9"/>
-  </w:num>
   <w:num w:numId="13" w16cid:durableId="1542202245">
-    <w:abstractNumId w:val="7"/>
+    <w:abstractNumId w:val="10"/>
   </w:num>
   <w:num w:numId="14" w16cid:durableId="435515120">
     <w:abstractNumId w:val="0"/>
   </w:num>
   <w:num w:numId="15" w16cid:durableId="885145657">
-    <w:abstractNumId w:val="3"/>
+    <w:abstractNumId w:val="4"/>
   </w:num>
   <w:num w:numId="16" w16cid:durableId="163208803">
-    <w:abstractNumId w:val="12"/>
+    <w:abstractNumId w:val="16"/>
+  </w:num>
+  <w:num w:numId="17" w16cid:durableId="1869685364">
+    <w:abstractNumId w:val="8"/>
+  </w:num>
+  <w:num w:numId="18" w16cid:durableId="1496648001">
+    <w:abstractNumId w:val="11"/>
+  </w:num>
+  <w:num w:numId="19" w16cid:durableId="2111003647">
+    <w:abstractNumId w:val="1"/>
+  </w:num>
+  <w:num w:numId="20" w16cid:durableId="264701854">
+    <w:abstractNumId w:val="19"/>
+  </w:num>
+  <w:num w:numId="21" w16cid:durableId="1668483823">
+    <w:abstractNumId w:val="5"/>
+  </w:num>
+  <w:num w:numId="22" w16cid:durableId="2029213697">
+    <w:abstractNumId w:val="20"/>
   </w:num>
 </w:numbering>
 </file>
@@ -14932,6 +16558,46 @@
       </w:tcPr>
     </w:tblStylePr>
   </w:style>
+  <w:style w:type="paragraph" w:customStyle="1" w:styleId="Default">
+    <w:name w:val="Default"/>
+    <w:rsid w:val="0052543E"/>
+    <w:pPr>
+      <w:autoSpaceDE w:val="0"/>
+      <w:autoSpaceDN w:val="0"/>
+      <w:adjustRightInd w:val="0"/>
+      <w:spacing w:after="0" w:line="240" w:lineRule="auto"/>
+    </w:pPr>
+    <w:rPr>
+      <w:rFonts w:ascii="Century Gothic" w:hAnsi="Century Gothic" w:cs="Century Gothic"/>
+      <w:color w:val="000000"/>
+      <w:kern w:val="0"/>
+      <w:szCs w:val="24"/>
+    </w:rPr>
+  </w:style>
+  <w:style w:type="character" w:styleId="Menzionenonrisolta">
+    <w:name w:val="Unresolved Mention"/>
+    <w:basedOn w:val="Carpredefinitoparagrafo"/>
+    <w:uiPriority w:val="99"/>
+    <w:semiHidden/>
+    <w:unhideWhenUsed/>
+    <w:rsid w:val="007568E7"/>
+    <w:rPr>
+      <w:color w:val="605E5C"/>
+      <w:shd w:val="clear" w:color="auto" w:fill="E1DFDD"/>
+    </w:rPr>
+  </w:style>
+  <w:style w:type="character" w:styleId="Collegamentovisitato">
+    <w:name w:val="FollowedHyperlink"/>
+    <w:basedOn w:val="Carpredefinitoparagrafo"/>
+    <w:uiPriority w:val="99"/>
+    <w:semiHidden/>
+    <w:unhideWhenUsed/>
+    <w:rsid w:val="007568E7"/>
+    <w:rPr>
+      <w:color w:val="96607D" w:themeColor="followedHyperlink"/>
+      <w:u w:val="single"/>
+    </w:rPr>
+  </w:style>
 </w:styles>
 </file>
 
@@ -15251,27 +16917,6 @@
 </file>
 
 <file path=customXml/item1.xml><?xml version="1.0" encoding="utf-8"?>
-<p:properties xmlns:p="http://schemas.microsoft.com/office/2006/metadata/properties" xmlns:xsi="http://www.w3.org/2001/XMLSchema-instance" xmlns:pc="http://schemas.microsoft.com/office/infopath/2007/PartnerControls">
-  <documentManagement>
-    <_activity xmlns="c1651439-6e46-4f78-9acb-4a905f92618b" xsi:nil="true"/>
-  </documentManagement>
-</p:properties>
-</file>
-
-<file path=customXml/item2.xml><?xml version="1.0" encoding="utf-8"?>
-<?mso-contentType ?>
-<FormTemplates xmlns="http://schemas.microsoft.com/sharepoint/v3/contenttype/forms">
-  <Display>DocumentLibraryForm</Display>
-  <Edit>DocumentLibraryForm</Edit>
-  <New>DocumentLibraryForm</New>
-</FormTemplates>
-</file>
-
-<file path=customXml/item3.xml><?xml version="1.0" encoding="utf-8"?>
-<b:Sources xmlns:b="http://schemas.openxmlformats.org/officeDocument/2006/bibliography" xmlns="http://schemas.openxmlformats.org/officeDocument/2006/bibliography" SelectedStyle="\APASixthEditionOfficeOnline.xsl" StyleName="APA" Version="6"/>
-</file>
-
-<file path=customXml/item4.xml><?xml version="1.0" encoding="utf-8"?>
 <ct:contentTypeSchema xmlns:ct="http://schemas.microsoft.com/office/2006/metadata/contentType" xmlns:ma="http://schemas.microsoft.com/office/2006/metadata/properties/metaAttributes" ct:_="" ma:_="" ma:contentTypeName="Documento" ma:contentTypeID="0x010100958A34E01316F8439D0AE3BCFE2030F9" ma:contentTypeVersion="15" ma:contentTypeDescription="Creare un nuovo documento." ma:contentTypeScope="" ma:versionID="42c7e40e66e0f4a1748ecd0cef7dc192">
   <xsd:schema xmlns:xsd="http://www.w3.org/2001/XMLSchema" xmlns:xs="http://www.w3.org/2001/XMLSchema" xmlns:p="http://schemas.microsoft.com/office/2006/metadata/properties" xmlns:ns3="25379ffa-1be3-456e-9b5c-56d073d73bb0" xmlns:ns4="c1651439-6e46-4f78-9acb-4a905f92618b" targetNamespace="http://schemas.microsoft.com/office/2006/metadata/properties" ma:root="true" ma:fieldsID="9321a28dca3f0d6f78662dde7f8125c2" ns3:_="" ns4:_="">
     <xsd:import namespace="25379ffa-1be3-456e-9b5c-56d073d73bb0"/>
@@ -15504,33 +17149,28 @@
 </ct:contentTypeSchema>
 </file>
 
-<file path=customXml/itemProps1.xml><?xml version="1.0" encoding="utf-8"?>
-<ds:datastoreItem xmlns:ds="http://schemas.openxmlformats.org/officeDocument/2006/customXml" ds:itemID="{8F1128D5-AA15-4654-9931-F50109245E42}">
-  <ds:schemaRefs>
-    <ds:schemaRef ds:uri="http://schemas.microsoft.com/office/2006/metadata/properties"/>
-    <ds:schemaRef ds:uri="http://schemas.microsoft.com/office/infopath/2007/PartnerControls"/>
-    <ds:schemaRef ds:uri="c1651439-6e46-4f78-9acb-4a905f92618b"/>
-  </ds:schemaRefs>
-</ds:datastoreItem>
+<file path=customXml/item2.xml><?xml version="1.0" encoding="utf-8"?>
+<b:Sources xmlns:b="http://schemas.openxmlformats.org/officeDocument/2006/bibliography" xmlns="http://schemas.openxmlformats.org/officeDocument/2006/bibliography" SelectedStyle="\APASixthEditionOfficeOnline.xsl" StyleName="APA" Version="6"/>
 </file>
 
-<file path=customXml/itemProps2.xml><?xml version="1.0" encoding="utf-8"?>
-<ds:datastoreItem xmlns:ds="http://schemas.openxmlformats.org/officeDocument/2006/customXml" ds:itemID="{34150ACC-3A32-4B10-936E-C3AEE55FE8FC}">
-  <ds:schemaRefs>
-    <ds:schemaRef ds:uri="http://schemas.microsoft.com/sharepoint/v3/contenttype/forms"/>
-  </ds:schemaRefs>
-</ds:datastoreItem>
+<file path=customXml/item3.xml><?xml version="1.0" encoding="utf-8"?>
+<?mso-contentType ?>
+<FormTemplates xmlns="http://schemas.microsoft.com/sharepoint/v3/contenttype/forms">
+  <Display>DocumentLibraryForm</Display>
+  <Edit>DocumentLibraryForm</Edit>
+  <New>DocumentLibraryForm</New>
+</FormTemplates>
 </file>
 
-<file path=customXml/itemProps3.xml><?xml version="1.0" encoding="utf-8"?>
-<ds:datastoreItem xmlns:ds="http://schemas.openxmlformats.org/officeDocument/2006/customXml" ds:itemID="{3EC47F37-6DD1-4A07-AC62-05F8DB7B4B69}">
-  <ds:schemaRefs>
-    <ds:schemaRef ds:uri="http://schemas.openxmlformats.org/officeDocument/2006/bibliography"/>
-  </ds:schemaRefs>
-</ds:datastoreItem>
+<file path=customXml/item4.xml><?xml version="1.0" encoding="utf-8"?>
+<p:properties xmlns:p="http://schemas.microsoft.com/office/2006/metadata/properties" xmlns:xsi="http://www.w3.org/2001/XMLSchema-instance" xmlns:pc="http://schemas.microsoft.com/office/infopath/2007/PartnerControls">
+  <documentManagement>
+    <_activity xmlns="c1651439-6e46-4f78-9acb-4a905f92618b" xsi:nil="true"/>
+  </documentManagement>
+</p:properties>
 </file>
 
-<file path=customXml/itemProps4.xml><?xml version="1.0" encoding="utf-8"?>
+<file path=customXml/itemProps1.xml><?xml version="1.0" encoding="utf-8"?>
 <ds:datastoreItem xmlns:ds="http://schemas.openxmlformats.org/officeDocument/2006/customXml" ds:itemID="{788E0E25-0DE4-4338-B881-6A90604A2A96}">
   <ds:schemaRefs>
     <ds:schemaRef ds:uri="http://schemas.microsoft.com/office/2006/metadata/contentType"/>
@@ -15547,4 +17187,30 @@
     <ds:schemaRef ds:uri="http://schemas.microsoft.com/internal/obd"/>
   </ds:schemaRefs>
 </ds:datastoreItem>
+</file>
+
+<file path=customXml/itemProps2.xml><?xml version="1.0" encoding="utf-8"?>
+<ds:datastoreItem xmlns:ds="http://schemas.openxmlformats.org/officeDocument/2006/customXml" ds:itemID="{3EC47F37-6DD1-4A07-AC62-05F8DB7B4B69}">
+  <ds:schemaRefs>
+    <ds:schemaRef ds:uri="http://schemas.openxmlformats.org/officeDocument/2006/bibliography"/>
+  </ds:schemaRefs>
+</ds:datastoreItem>
+</file>
+
+<file path=customXml/itemProps3.xml><?xml version="1.0" encoding="utf-8"?>
+<ds:datastoreItem xmlns:ds="http://schemas.openxmlformats.org/officeDocument/2006/customXml" ds:itemID="{34150ACC-3A32-4B10-936E-C3AEE55FE8FC}">
+  <ds:schemaRefs>
+    <ds:schemaRef ds:uri="http://schemas.microsoft.com/sharepoint/v3/contenttype/forms"/>
+  </ds:schemaRefs>
+</ds:datastoreItem>
+</file>
+
+<file path=customXml/itemProps4.xml><?xml version="1.0" encoding="utf-8"?>
+<ds:datastoreItem xmlns:ds="http://schemas.openxmlformats.org/officeDocument/2006/customXml" ds:itemID="{8F1128D5-AA15-4654-9931-F50109245E42}">
+  <ds:schemaRefs>
+    <ds:schemaRef ds:uri="http://schemas.microsoft.com/office/2006/metadata/properties"/>
+    <ds:schemaRef ds:uri="http://schemas.microsoft.com/office/infopath/2007/PartnerControls"/>
+    <ds:schemaRef ds:uri="c1651439-6e46-4f78-9acb-4a905f92618b"/>
+  </ds:schemaRefs>
+</ds:datastoreItem>
 </file>
</xml_diff>